<commit_message>
Update minutes for final submission
</commit_message>
<xml_diff>
--- a/03-Communication-and-Teamwork/Meetings/Minutes/Mentor-Client-Meetings/Meeting Minutes 2025-03-20 (Client Kick-off).docx
+++ b/03-Communication-and-Teamwork/Meetings/Minutes/Mentor-Client-Meetings/Meeting Minutes 2025-03-20 (Client Kick-off).docx
@@ -70,14 +70,14 @@
                 <w:rFonts w:ascii="Calibri" w:hAnsi="Calibri" w:cs="Calibri"/>
                 <w:b/>
               </w:rPr>
-              <w:t>Client/</w:t>
-            </w:r>
-            <w:r>
-              <w:rPr>
-                <w:rFonts w:ascii="Calibri" w:hAnsi="Calibri" w:cs="Calibri"/>
-                <w:b/>
-              </w:rPr>
-              <w:t>Project:</w:t>
+              <w:t>Client</w:t>
+            </w:r>
+            <w:r>
+              <w:rPr>
+                <w:rFonts w:ascii="Calibri" w:hAnsi="Calibri" w:cs="Calibri"/>
+                <w:b/>
+              </w:rPr>
+              <w:t>:</w:t>
             </w:r>
           </w:p>
         </w:tc>
@@ -90,38 +90,17 @@
           </w:tcPr>
           <w:p>
             <w:pPr>
-              <w:jc w:val="center"/>
-              <w:rPr>
-                <w:rFonts w:ascii="Calibri" w:hAnsi="Calibri" w:cs="Calibri"/>
-                <w:b/>
-              </w:rPr>
-            </w:pPr>
-            <w:r>
-              <w:rPr>
-                <w:rFonts w:ascii="Calibri" w:hAnsi="Calibri" w:cs="Calibri"/>
-                <w:b/>
-              </w:rPr>
-              <w:t xml:space="preserve">Raymond Lutui </w:t>
-            </w:r>
-            <w:r>
-              <w:rPr>
-                <w:rFonts w:ascii="Aptos" w:hAnsi="Aptos" w:cs="Calibri"/>
-                <w:b/>
-                <w:sz w:val="14"/>
-                <w:szCs w:val="14"/>
-              </w:rPr>
-              <w:t xml:space="preserve">- </w:t>
-            </w:r>
-            <w:r>
-              <w:rPr>
-                <w:rFonts w:ascii="Aptos" w:hAnsi="Aptos"/>
-                <w:b/>
-                <w:bCs/>
-                <w:color w:val="000000"/>
-                <w:sz w:val="22"/>
-                <w:szCs w:val="22"/>
-              </w:rPr>
-              <w:t>Network Performance Evaluation on Linux Based Operating Systems</w:t>
+              <w:rPr>
+                <w:rFonts w:ascii="Calibri" w:hAnsi="Calibri" w:cs="Calibri"/>
+                <w:b/>
+              </w:rPr>
+            </w:pPr>
+            <w:r>
+              <w:rPr>
+                <w:rFonts w:ascii="Calibri" w:hAnsi="Calibri" w:cs="Calibri"/>
+                <w:b/>
+              </w:rPr>
+              <w:t>Raymond Lutui</w:t>
             </w:r>
           </w:p>
         </w:tc>
@@ -145,23 +124,8 @@
                 <w:rFonts w:ascii="Calibri" w:hAnsi="Calibri" w:cs="Calibri"/>
                 <w:b/>
               </w:rPr>
-              <w:t>Purpose</w:t>
-            </w:r>
-            <w:r>
-              <w:rPr>
-                <w:rFonts w:ascii="Calibri" w:hAnsi="Calibri" w:cs="Calibri"/>
-                <w:b/>
-              </w:rPr>
-              <w:t>:</w:t>
-            </w:r>
-          </w:p>
-          <w:p>
-            <w:pPr>
-              <w:rPr>
-                <w:rFonts w:ascii="Calibri" w:hAnsi="Calibri" w:cs="Calibri"/>
-                <w:b/>
-              </w:rPr>
-            </w:pPr>
+              <w:t>Project:</w:t>
+            </w:r>
           </w:p>
         </w:tc>
         <w:tc>
@@ -182,18 +146,11 @@
               <w:rPr>
                 <w:rFonts w:ascii="Calibri" w:hAnsi="Calibri" w:cs="Calibri"/>
                 <w:b/>
-              </w:rPr>
-              <w:t>Meeting with mentor / client to figure out what the project requires</w:t>
-            </w:r>
-          </w:p>
-          <w:p>
-            <w:pPr>
-              <w:ind w:left="360"/>
-              <w:rPr>
-                <w:rFonts w:ascii="Calibri" w:hAnsi="Calibri" w:cs="Calibri"/>
-                <w:b/>
-              </w:rPr>
-            </w:pPr>
+                <w:bCs/>
+                <w:color w:val="000000"/>
+              </w:rPr>
+              <w:t>Network Performance Evaluation on Linux Based Operating Systems</w:t>
+            </w:r>
           </w:p>
         </w:tc>
       </w:tr>
@@ -201,49 +158,52 @@
         <w:tc>
           <w:tcPr>
             <w:tcW w:w="2952" w:type="dxa"/>
-            <w:vAlign w:val="center"/>
-          </w:tcPr>
-          <w:p>
-            <w:pPr>
-              <w:rPr>
-                <w:rFonts w:ascii="Calibri" w:hAnsi="Calibri" w:cs="Calibri"/>
-                <w:b/>
-              </w:rPr>
-            </w:pPr>
-            <w:r>
-              <w:rPr>
-                <w:rFonts w:ascii="Calibri" w:hAnsi="Calibri" w:cs="Calibri"/>
-                <w:b/>
-              </w:rPr>
-              <w:t>Meeting called by:</w:t>
-            </w:r>
-          </w:p>
-          <w:p>
-            <w:pPr>
-              <w:rPr>
-                <w:rFonts w:ascii="Calibri" w:hAnsi="Calibri" w:cs="Calibri"/>
-                <w:b/>
-              </w:rPr>
-            </w:pPr>
+            <w:shd w:val="clear" w:color="auto" w:fill="D9D9D9"/>
+            <w:vAlign w:val="center"/>
+          </w:tcPr>
+          <w:p>
+            <w:pPr>
+              <w:rPr>
+                <w:rFonts w:ascii="Calibri" w:hAnsi="Calibri" w:cs="Calibri"/>
+                <w:b/>
+              </w:rPr>
+            </w:pPr>
+            <w:r>
+              <w:rPr>
+                <w:rFonts w:ascii="Calibri" w:hAnsi="Calibri" w:cs="Calibri"/>
+                <w:b/>
+              </w:rPr>
+              <w:t>Purpose</w:t>
+            </w:r>
+            <w:r>
+              <w:rPr>
+                <w:rFonts w:ascii="Calibri" w:hAnsi="Calibri" w:cs="Calibri"/>
+                <w:b/>
+              </w:rPr>
+              <w:t>:</w:t>
+            </w:r>
           </w:p>
         </w:tc>
         <w:tc>
           <w:tcPr>
             <w:tcW w:w="7038" w:type="dxa"/>
             <w:gridSpan w:val="2"/>
-            <w:vAlign w:val="center"/>
-          </w:tcPr>
-          <w:p>
-            <w:pPr>
-              <w:rPr>
-                <w:rFonts w:ascii="Calibri" w:hAnsi="Calibri" w:cs="Calibri"/>
-              </w:rPr>
-            </w:pPr>
-            <w:r>
-              <w:rPr>
-                <w:rFonts w:ascii="Calibri" w:hAnsi="Calibri" w:cs="Calibri"/>
-              </w:rPr>
-              <w:t xml:space="preserve">Thomas Robinson </w:t>
+            <w:shd w:val="clear" w:color="auto" w:fill="D9D9D9"/>
+            <w:vAlign w:val="center"/>
+          </w:tcPr>
+          <w:p>
+            <w:pPr>
+              <w:rPr>
+                <w:rFonts w:ascii="Calibri" w:hAnsi="Calibri" w:cs="Calibri"/>
+                <w:b/>
+              </w:rPr>
+            </w:pPr>
+            <w:r>
+              <w:rPr>
+                <w:rFonts w:ascii="Calibri" w:hAnsi="Calibri" w:cs="Calibri"/>
+                <w:b/>
+              </w:rPr>
+              <w:t>Meeting with mentor/client to figure out what the project requires</w:t>
             </w:r>
           </w:p>
         </w:tc>
@@ -258,157 +218,36 @@
             <w:pPr>
               <w:rPr>
                 <w:rFonts w:ascii="Calibri" w:hAnsi="Calibri" w:cs="Calibri"/>
-              </w:rPr>
-            </w:pPr>
-            <w:r>
-              <w:rPr>
-                <w:rFonts w:ascii="Calibri" w:hAnsi="Calibri" w:cs="Calibri"/>
-                <w:b/>
-              </w:rPr>
-              <w:t>Location:</w:t>
-            </w:r>
-            <w:r>
-              <w:rPr>
-                <w:rFonts w:ascii="Calibri" w:hAnsi="Calibri" w:cs="Calibri"/>
-                <w:b/>
-              </w:rPr>
-              <w:t xml:space="preserve"> </w:t>
-            </w:r>
-            <w:r>
-              <w:rPr>
-                <w:rFonts w:ascii="Calibri" w:hAnsi="Calibri" w:cs="Calibri"/>
-                <w:b/>
-              </w:rPr>
-              <w:t>WZ</w:t>
-            </w:r>
-            <w:r>
-              <w:rPr>
-                <w:rFonts w:ascii="Calibri" w:hAnsi="Calibri" w:cs="Calibri"/>
-                <w:b/>
-              </w:rPr>
-              <w:t>110</w:t>
-            </w:r>
-            <w:r>
-              <w:rPr>
-                <w:rFonts w:ascii="Calibri" w:hAnsi="Calibri" w:cs="Calibri"/>
-                <w:b/>
-              </w:rPr>
-              <w:t>1</w:t>
-            </w:r>
-          </w:p>
-          <w:p>
-            <w:pPr>
-              <w:rPr>
-                <w:rFonts w:ascii="Calibri" w:hAnsi="Calibri" w:cs="Calibri"/>
-                <w:b/>
-              </w:rPr>
-            </w:pPr>
-          </w:p>
-        </w:tc>
-        <w:tc>
-          <w:tcPr>
-            <w:tcW w:w="2952" w:type="dxa"/>
-            <w:vAlign w:val="center"/>
-          </w:tcPr>
-          <w:p>
-            <w:pPr>
-              <w:rPr>
-                <w:rFonts w:ascii="Calibri" w:hAnsi="Calibri" w:cs="Calibri"/>
-              </w:rPr>
-            </w:pPr>
-            <w:r>
-              <w:rPr>
-                <w:rFonts w:ascii="Calibri" w:hAnsi="Calibri" w:cs="Calibri"/>
-                <w:b/>
-              </w:rPr>
-              <w:t>Date:</w:t>
-            </w:r>
-            <w:r>
-              <w:rPr>
-                <w:rFonts w:ascii="Calibri" w:hAnsi="Calibri" w:cs="Calibri"/>
-                <w:b/>
-              </w:rPr>
-              <w:t xml:space="preserve"> </w:t>
-            </w:r>
-            <w:r>
-              <w:rPr>
-                <w:rFonts w:ascii="Calibri" w:hAnsi="Calibri" w:cs="Calibri"/>
-                <w:b/>
-              </w:rPr>
-              <w:t>20</w:t>
-            </w:r>
-            <w:r>
-              <w:rPr>
-                <w:rFonts w:ascii="Calibri" w:hAnsi="Calibri" w:cs="Calibri"/>
-                <w:b/>
-              </w:rPr>
-              <w:t>/03/2025</w:t>
-            </w:r>
-          </w:p>
-          <w:p>
-            <w:pPr>
-              <w:rPr>
-                <w:rFonts w:ascii="Calibri" w:hAnsi="Calibri" w:cs="Calibri"/>
-                <w:b/>
-              </w:rPr>
-            </w:pPr>
-          </w:p>
-        </w:tc>
-        <w:tc>
-          <w:tcPr>
-            <w:tcW w:w="4086" w:type="dxa"/>
-            <w:vAlign w:val="center"/>
-          </w:tcPr>
-          <w:p>
-            <w:pPr>
-              <w:rPr>
-                <w:rFonts w:ascii="Calibri" w:hAnsi="Calibri" w:cs="Calibri"/>
-              </w:rPr>
-            </w:pPr>
-            <w:r>
-              <w:rPr>
-                <w:rFonts w:ascii="Calibri" w:hAnsi="Calibri" w:cs="Calibri"/>
-                <w:b/>
-              </w:rPr>
-              <w:t>Time:</w:t>
-            </w:r>
-            <w:r>
-              <w:rPr>
-                <w:rFonts w:ascii="Calibri" w:hAnsi="Calibri" w:cs="Calibri"/>
-              </w:rPr>
-              <w:t xml:space="preserve"> </w:t>
-            </w:r>
-            <w:r>
-              <w:rPr>
-                <w:rFonts w:ascii="Calibri" w:hAnsi="Calibri" w:cs="Calibri"/>
-              </w:rPr>
-              <w:t>10</w:t>
-            </w:r>
-            <w:r>
-              <w:rPr>
-                <w:rFonts w:ascii="Calibri" w:hAnsi="Calibri" w:cs="Calibri"/>
-              </w:rPr>
-              <w:t xml:space="preserve">am – </w:t>
-            </w:r>
-            <w:r>
-              <w:rPr>
-                <w:rFonts w:ascii="Calibri" w:hAnsi="Calibri" w:cs="Calibri"/>
-              </w:rPr>
-              <w:t>11</w:t>
-            </w:r>
-            <w:r>
-              <w:rPr>
-                <w:rFonts w:ascii="Calibri" w:hAnsi="Calibri" w:cs="Calibri"/>
-              </w:rPr>
-              <w:t xml:space="preserve"> am</w:t>
-            </w:r>
-          </w:p>
-          <w:p>
-            <w:pPr>
-              <w:rPr>
-                <w:rFonts w:ascii="Calibri" w:hAnsi="Calibri" w:cs="Calibri"/>
-              </w:rPr>
-            </w:pPr>
+                <w:b/>
+              </w:rPr>
+            </w:pPr>
+            <w:r>
+              <w:rPr>
+                <w:rFonts w:ascii="Calibri" w:hAnsi="Calibri" w:cs="Calibri"/>
+                <w:b/>
+              </w:rPr>
+              <w:t>Meeting called by:</w:t>
+            </w:r>
+          </w:p>
+        </w:tc>
+        <w:tc>
+          <w:tcPr>
+            <w:tcW w:w="7038" w:type="dxa"/>
+            <w:gridSpan w:val="2"/>
+            <w:vAlign w:val="center"/>
+          </w:tcPr>
+          <w:p>
+            <w:pPr>
+              <w:rPr>
+                <w:rFonts w:ascii="Calibri" w:hAnsi="Calibri" w:cs="Calibri"/>
+              </w:rPr>
+            </w:pPr>
+            <w:r>
+              <w:rPr>
+                <w:rFonts w:ascii="Calibri" w:hAnsi="Calibri" w:cs="Calibri"/>
+              </w:rPr>
+              <w:t xml:space="preserve">Thomas Robinson </w:t>
+            </w:r>
           </w:p>
         </w:tc>
       </w:tr>
@@ -422,7 +261,160 @@
             <w:pPr>
               <w:rPr>
                 <w:rFonts w:ascii="Calibri" w:hAnsi="Calibri" w:cs="Calibri"/>
-                <w:b/>
+              </w:rPr>
+            </w:pPr>
+            <w:r>
+              <w:rPr>
+                <w:rFonts w:ascii="Calibri" w:hAnsi="Calibri" w:cs="Calibri"/>
+                <w:b/>
+              </w:rPr>
+              <w:t>Location:</w:t>
+            </w:r>
+            <w:r>
+              <w:rPr>
+                <w:rFonts w:ascii="Calibri" w:hAnsi="Calibri" w:cs="Calibri"/>
+                <w:b/>
+              </w:rPr>
+              <w:t xml:space="preserve"> </w:t>
+            </w:r>
+            <w:r>
+              <w:rPr>
+                <w:rFonts w:ascii="Calibri" w:hAnsi="Calibri" w:cs="Calibri"/>
+                <w:bCs/>
+              </w:rPr>
+              <w:t>WZ</w:t>
+            </w:r>
+            <w:r>
+              <w:rPr>
+                <w:rFonts w:ascii="Calibri" w:hAnsi="Calibri" w:cs="Calibri"/>
+                <w:bCs/>
+              </w:rPr>
+              <w:t>110</w:t>
+            </w:r>
+            <w:r>
+              <w:rPr>
+                <w:rFonts w:ascii="Calibri" w:hAnsi="Calibri" w:cs="Calibri"/>
+                <w:bCs/>
+              </w:rPr>
+              <w:t>1</w:t>
+            </w:r>
+          </w:p>
+        </w:tc>
+        <w:tc>
+          <w:tcPr>
+            <w:tcW w:w="2952" w:type="dxa"/>
+            <w:vAlign w:val="center"/>
+          </w:tcPr>
+          <w:p>
+            <w:pPr>
+              <w:rPr>
+                <w:rFonts w:ascii="Calibri" w:hAnsi="Calibri" w:cs="Calibri"/>
+              </w:rPr>
+            </w:pPr>
+            <w:r>
+              <w:rPr>
+                <w:rFonts w:ascii="Calibri" w:hAnsi="Calibri" w:cs="Calibri"/>
+                <w:b/>
+              </w:rPr>
+              <w:t>Date:</w:t>
+            </w:r>
+            <w:r>
+              <w:rPr>
+                <w:rFonts w:ascii="Calibri" w:hAnsi="Calibri" w:cs="Calibri"/>
+                <w:b/>
+              </w:rPr>
+              <w:t xml:space="preserve"> </w:t>
+            </w:r>
+            <w:r>
+              <w:rPr>
+                <w:rFonts w:ascii="Calibri" w:hAnsi="Calibri" w:cs="Calibri"/>
+                <w:bCs/>
+              </w:rPr>
+              <w:t>20</w:t>
+            </w:r>
+            <w:r>
+              <w:rPr>
+                <w:rFonts w:ascii="Calibri" w:hAnsi="Calibri" w:cs="Calibri"/>
+                <w:bCs/>
+              </w:rPr>
+              <w:t>/03/2025</w:t>
+            </w:r>
+          </w:p>
+        </w:tc>
+        <w:tc>
+          <w:tcPr>
+            <w:tcW w:w="4086" w:type="dxa"/>
+            <w:vAlign w:val="center"/>
+          </w:tcPr>
+          <w:p>
+            <w:pPr>
+              <w:rPr>
+                <w:rFonts w:ascii="Calibri" w:hAnsi="Calibri" w:cs="Calibri"/>
+              </w:rPr>
+            </w:pPr>
+            <w:r>
+              <w:rPr>
+                <w:rFonts w:ascii="Calibri" w:hAnsi="Calibri" w:cs="Calibri"/>
+                <w:b/>
+              </w:rPr>
+              <w:t>Time:</w:t>
+            </w:r>
+            <w:r>
+              <w:rPr>
+                <w:rFonts w:ascii="Calibri" w:hAnsi="Calibri" w:cs="Calibri"/>
+              </w:rPr>
+              <w:t xml:space="preserve"> </w:t>
+            </w:r>
+            <w:r>
+              <w:rPr>
+                <w:rFonts w:ascii="Calibri" w:hAnsi="Calibri" w:cs="Calibri"/>
+              </w:rPr>
+              <w:t>10</w:t>
+            </w:r>
+            <w:r>
+              <w:rPr>
+                <w:rFonts w:ascii="Calibri" w:hAnsi="Calibri" w:cs="Calibri"/>
+              </w:rPr>
+              <w:t>:00</w:t>
+            </w:r>
+            <w:r>
+              <w:rPr>
+                <w:rFonts w:ascii="Calibri" w:hAnsi="Calibri" w:cs="Calibri"/>
+              </w:rPr>
+              <w:t xml:space="preserve">am – </w:t>
+            </w:r>
+            <w:r>
+              <w:rPr>
+                <w:rFonts w:ascii="Calibri" w:hAnsi="Calibri" w:cs="Calibri"/>
+              </w:rPr>
+              <w:t>11</w:t>
+            </w:r>
+            <w:r>
+              <w:rPr>
+                <w:rFonts w:ascii="Calibri" w:hAnsi="Calibri" w:cs="Calibri"/>
+              </w:rPr>
+              <w:t>:00</w:t>
+            </w:r>
+            <w:r>
+              <w:rPr>
+                <w:rFonts w:ascii="Calibri" w:hAnsi="Calibri" w:cs="Calibri"/>
+              </w:rPr>
+              <w:t>am</w:t>
+            </w:r>
+          </w:p>
+        </w:tc>
+      </w:tr>
+      <w:tr>
+        <w:tc>
+          <w:tcPr>
+            <w:tcW w:w="2952" w:type="dxa"/>
+            <w:vAlign w:val="center"/>
+          </w:tcPr>
+          <w:p>
+            <w:pPr>
+              <w:rPr>
+                <w:rFonts w:ascii="Calibri" w:hAnsi="Calibri" w:cs="Calibri"/>
+                <w:bCs/>
               </w:rPr>
             </w:pPr>
             <w:r>
@@ -432,14 +424,20 @@
               </w:rPr>
               <w:t>QA:</w:t>
             </w:r>
-          </w:p>
-          <w:p>
-            <w:pPr>
-              <w:rPr>
-                <w:rFonts w:ascii="Calibri" w:hAnsi="Calibri" w:cs="Calibri"/>
-                <w:b/>
-              </w:rPr>
-            </w:pPr>
+            <w:r>
+              <w:rPr>
+                <w:rFonts w:ascii="Calibri" w:hAnsi="Calibri" w:cs="Calibri"/>
+                <w:b/>
+              </w:rPr>
+              <w:t xml:space="preserve"> </w:t>
+            </w:r>
+            <w:r>
+              <w:rPr>
+                <w:rFonts w:ascii="Calibri" w:hAnsi="Calibri" w:cs="Calibri"/>
+                <w:bCs/>
+              </w:rPr>
+              <w:t>Larissa Goh</w:t>
+            </w:r>
           </w:p>
         </w:tc>
         <w:tc>
@@ -458,38 +456,23 @@
                 <w:rFonts w:ascii="Calibri" w:hAnsi="Calibri" w:cs="Calibri"/>
                 <w:b/>
               </w:rPr>
-              <w:t>Version</w:t>
-            </w:r>
-            <w:r>
-              <w:rPr>
-                <w:rFonts w:ascii="Calibri" w:hAnsi="Calibri" w:cs="Calibri"/>
-                <w:b/>
-              </w:rPr>
-              <w:t xml:space="preserve">: </w:t>
-            </w:r>
-            <w:r>
-              <w:rPr>
-                <w:rFonts w:ascii="Calibri" w:hAnsi="Calibri" w:cs="Calibri"/>
-                <w:b/>
+              <w:t xml:space="preserve">Version: </w:t>
+            </w:r>
+            <w:r>
+              <w:rPr>
+                <w:rFonts w:ascii="Calibri" w:hAnsi="Calibri" w:cs="Calibri"/>
+                <w:bCs/>
               </w:rPr>
               <w:t>1.</w:t>
             </w:r>
             <w:r>
               <w:rPr>
                 <w:rFonts w:ascii="Calibri" w:hAnsi="Calibri" w:cs="Calibri"/>
-                <w:b/>
+                <w:bCs/>
               </w:rPr>
               <w:t>0</w:t>
             </w:r>
           </w:p>
-          <w:p>
-            <w:pPr>
-              <w:rPr>
-                <w:rFonts w:ascii="Calibri" w:hAnsi="Calibri" w:cs="Calibri"/>
-                <w:b/>
-              </w:rPr>
-            </w:pPr>
-          </w:p>
         </w:tc>
         <w:tc>
           <w:tcPr>
@@ -507,30 +490,15 @@
                 <w:rFonts w:ascii="Calibri" w:hAnsi="Calibri" w:cs="Calibri"/>
                 <w:b/>
               </w:rPr>
-              <w:t>Minutes Reviewed By</w:t>
-            </w:r>
-            <w:r>
-              <w:rPr>
-                <w:rFonts w:ascii="Calibri" w:hAnsi="Calibri" w:cs="Calibri"/>
-                <w:b/>
-              </w:rPr>
-              <w:t xml:space="preserve">: </w:t>
-            </w:r>
-            <w:r>
-              <w:rPr>
-                <w:rFonts w:ascii="Calibri" w:hAnsi="Calibri" w:cs="Calibri"/>
-                <w:b/>
+              <w:t xml:space="preserve">Minutes Reviewed By: </w:t>
+            </w:r>
+            <w:r>
+              <w:rPr>
+                <w:rFonts w:ascii="Calibri" w:hAnsi="Calibri" w:cs="Calibri"/>
+                <w:bCs/>
               </w:rPr>
               <w:t>Thomas</w:t>
             </w:r>
-          </w:p>
-          <w:p>
-            <w:pPr>
-              <w:rPr>
-                <w:rFonts w:ascii="Calibri" w:hAnsi="Calibri" w:cs="Calibri"/>
-                <w:b/>
-              </w:rPr>
-            </w:pPr>
           </w:p>
         </w:tc>
       </w:tr>
@@ -555,14 +523,7 @@
           <w:rFonts w:ascii="Calibri" w:hAnsi="Calibri" w:cs="Calibri"/>
           <w:b/>
         </w:rPr>
-        <w:t xml:space="preserve">Meeting </w:t>
-      </w:r>
-      <w:r>
-        <w:rPr>
-          <w:rFonts w:ascii="Calibri" w:hAnsi="Calibri" w:cs="Calibri"/>
-          <w:b/>
-        </w:rPr>
-        <w:t>Attendees</w:t>
+        <w:t>Meeting Attendees</w:t>
       </w:r>
     </w:p>
     <w:p>
@@ -625,12 +586,16 @@
             <w:pPr>
               <w:rPr>
                 <w:rFonts w:ascii="Calibri" w:hAnsi="Calibri" w:cs="Calibri"/>
+                <w:b/>
+                <w:bCs/>
                 <w:i/>
               </w:rPr>
             </w:pPr>
             <w:r>
               <w:rPr>
                 <w:rFonts w:ascii="Calibri" w:hAnsi="Calibri" w:cs="Calibri"/>
+                <w:b/>
+                <w:bCs/>
                 <w:i/>
               </w:rPr>
               <w:t>Names</w:t>
@@ -646,12 +611,16 @@
             <w:pPr>
               <w:rPr>
                 <w:rFonts w:ascii="Calibri" w:hAnsi="Calibri" w:cs="Calibri"/>
+                <w:b/>
+                <w:bCs/>
                 <w:i/>
               </w:rPr>
             </w:pPr>
             <w:r>
               <w:rPr>
                 <w:rFonts w:ascii="Calibri" w:hAnsi="Calibri" w:cs="Calibri"/>
+                <w:b/>
+                <w:bCs/>
                 <w:i/>
               </w:rPr>
               <w:t>Representing</w:t>
@@ -668,7 +637,7 @@
           <w:p>
             <w:pPr>
               <w:rPr>
-                <w:rFonts w:ascii="Aptos" w:hAnsi="Aptos" w:cs="Calibri"/>
+                <w:rFonts w:ascii="Calibri" w:hAnsi="Calibri" w:cs="Calibri"/>
               </w:rPr>
             </w:pPr>
             <w:r>
@@ -707,12 +676,12 @@
           <w:p>
             <w:pPr>
               <w:rPr>
-                <w:rFonts w:ascii="Aptos" w:hAnsi="Aptos" w:cs="Calibri"/>
-              </w:rPr>
-            </w:pPr>
-            <w:r>
-              <w:rPr>
-                <w:rFonts w:ascii="Aptos" w:hAnsi="Aptos"/>
+                <w:rFonts w:ascii="Calibri" w:hAnsi="Calibri" w:cs="Calibri"/>
+              </w:rPr>
+            </w:pPr>
+            <w:r>
+              <w:rPr>
+                <w:rFonts w:ascii="Calibri" w:hAnsi="Calibri" w:cs="Calibri"/>
               </w:rPr>
               <w:t>Nathan Quai Hoi</w:t>
             </w:r>
@@ -752,12 +721,12 @@
           <w:p>
             <w:pPr>
               <w:rPr>
-                <w:rFonts w:ascii="Aptos" w:hAnsi="Aptos" w:cs="Calibri"/>
-              </w:rPr>
-            </w:pPr>
-            <w:r>
-              <w:rPr>
-                <w:rFonts w:ascii="Aptos" w:hAnsi="Aptos"/>
+                <w:rFonts w:ascii="Calibri" w:hAnsi="Calibri" w:cs="Calibri"/>
+              </w:rPr>
+            </w:pPr>
+            <w:r>
+              <w:rPr>
+                <w:rFonts w:ascii="Calibri" w:hAnsi="Calibri" w:cs="Calibri"/>
               </w:rPr>
               <w:t>Win Phyo</w:t>
             </w:r>
@@ -790,12 +759,12 @@
           <w:p>
             <w:pPr>
               <w:rPr>
-                <w:rFonts w:ascii="Aptos" w:hAnsi="Aptos" w:cs="Calibri"/>
-              </w:rPr>
-            </w:pPr>
-            <w:r>
-              <w:rPr>
-                <w:rFonts w:ascii="Aptos" w:hAnsi="Aptos"/>
+                <w:rFonts w:ascii="Calibri" w:hAnsi="Calibri" w:cs="Calibri"/>
+              </w:rPr>
+            </w:pPr>
+            <w:r>
+              <w:rPr>
+                <w:rFonts w:ascii="Calibri" w:hAnsi="Calibri" w:cs="Calibri"/>
               </w:rPr>
               <w:t>Zafar Azad</w:t>
             </w:r>
@@ -828,12 +797,12 @@
           <w:p>
             <w:pPr>
               <w:rPr>
-                <w:rFonts w:ascii="Aptos" w:hAnsi="Aptos" w:cs="Calibri"/>
-              </w:rPr>
-            </w:pPr>
-            <w:r>
-              <w:rPr>
-                <w:rFonts w:ascii="Aptos" w:hAnsi="Aptos"/>
+                <w:rFonts w:ascii="Calibri" w:hAnsi="Calibri" w:cs="Calibri"/>
+              </w:rPr>
+            </w:pPr>
+            <w:r>
+              <w:rPr>
+                <w:rFonts w:ascii="Calibri" w:hAnsi="Calibri" w:cs="Calibri"/>
               </w:rPr>
               <w:t>Larissa Goh</w:t>
             </w:r>
@@ -866,12 +835,12 @@
           <w:p>
             <w:pPr>
               <w:rPr>
-                <w:rFonts w:ascii="Aptos" w:hAnsi="Aptos" w:cs="Calibri"/>
-              </w:rPr>
-            </w:pPr>
-            <w:r>
-              <w:rPr>
-                <w:rFonts w:ascii="Aptos" w:hAnsi="Aptos"/>
+                <w:rFonts w:ascii="Calibri" w:hAnsi="Calibri" w:cs="Calibri"/>
+              </w:rPr>
+            </w:pPr>
+            <w:r>
+              <w:rPr>
+                <w:rFonts w:ascii="Calibri" w:hAnsi="Calibri" w:cs="Calibri"/>
               </w:rPr>
               <w:t>Charmi Patel</w:t>
             </w:r>
@@ -904,12 +873,12 @@
           <w:p>
             <w:pPr>
               <w:rPr>
-                <w:rFonts w:ascii="Aptos" w:hAnsi="Aptos" w:cs="Calibri"/>
-              </w:rPr>
-            </w:pPr>
-            <w:r>
-              <w:rPr>
-                <w:rFonts w:ascii="Aptos" w:hAnsi="Aptos" w:cs="Calibri"/>
+                <w:rFonts w:ascii="Calibri" w:hAnsi="Calibri" w:cs="Calibri"/>
+              </w:rPr>
+            </w:pPr>
+            <w:r>
+              <w:rPr>
+                <w:rFonts w:ascii="Calibri" w:hAnsi="Calibri" w:cs="Calibri"/>
               </w:rPr>
               <w:t>Kylie Afable</w:t>
             </w:r>
@@ -947,18 +916,10 @@
             </w:pPr>
             <w:r>
               <w:rPr>
-                <w:rFonts w:ascii="Aptos" w:hAnsi="Aptos"/>
-              </w:rPr>
-              <w:t xml:space="preserve">Daniel </w:t>
-            </w:r>
-            <w:proofErr w:type="spellStart"/>
-            <w:r>
-              <w:rPr>
-                <w:rFonts w:ascii="Aptos" w:hAnsi="Aptos"/>
-              </w:rPr>
-              <w:t>Vaipulu</w:t>
-            </w:r>
-            <w:proofErr w:type="spellEnd"/>
+                <w:rFonts w:ascii="Calibri" w:hAnsi="Calibri" w:cs="Calibri"/>
+              </w:rPr>
+              <w:t>Daniel Vaipulu</w:t>
+            </w:r>
           </w:p>
         </w:tc>
         <w:tc>
@@ -993,7 +954,7 @@
             </w:pPr>
             <w:r>
               <w:rPr>
-                <w:rFonts w:ascii="Aptos" w:hAnsi="Aptos"/>
+                <w:rFonts w:ascii="Calibri" w:hAnsi="Calibri" w:cs="Calibri"/>
               </w:rPr>
               <w:t>Raymond Lutui</w:t>
             </w:r>
@@ -1054,12 +1015,16 @@
             <w:pPr>
               <w:rPr>
                 <w:rFonts w:ascii="Calibri" w:hAnsi="Calibri" w:cs="Calibri"/>
+                <w:b/>
+                <w:bCs/>
                 <w:i/>
               </w:rPr>
             </w:pPr>
             <w:r>
               <w:rPr>
                 <w:rFonts w:ascii="Calibri" w:hAnsi="Calibri" w:cs="Calibri"/>
+                <w:b/>
+                <w:bCs/>
                 <w:i/>
               </w:rPr>
               <w:t>Names</w:t>
@@ -1075,12 +1040,16 @@
             <w:pPr>
               <w:rPr>
                 <w:rFonts w:ascii="Calibri" w:hAnsi="Calibri" w:cs="Calibri"/>
+                <w:b/>
+                <w:bCs/>
                 <w:i/>
               </w:rPr>
             </w:pPr>
             <w:r>
               <w:rPr>
                 <w:rFonts w:ascii="Calibri" w:hAnsi="Calibri" w:cs="Calibri"/>
+                <w:b/>
+                <w:bCs/>
                 <w:i/>
               </w:rPr>
               <w:t>Representing</w:t>
@@ -1233,13 +1202,6 @@
               <w:t xml:space="preserve"> Nathan Quai Hoi</w:t>
             </w:r>
           </w:p>
-          <w:p>
-            <w:pPr>
-              <w:rPr>
-                <w:rFonts w:ascii="Calibri" w:hAnsi="Calibri" w:cs="Calibri"/>
-              </w:rPr>
-            </w:pPr>
-          </w:p>
         </w:tc>
         <w:tc>
           <w:tcPr>
@@ -1256,13 +1218,7 @@
               <w:rPr>
                 <w:rFonts w:ascii="Calibri" w:hAnsi="Calibri" w:cs="Calibri"/>
               </w:rPr>
-              <w:t>M</w:t>
-            </w:r>
-            <w:r>
-              <w:rPr>
-                <w:rFonts w:ascii="Calibri" w:hAnsi="Calibri" w:cs="Calibri"/>
-              </w:rPr>
-              <w:t xml:space="preserve">inutes </w:t>
+              <w:t xml:space="preserve">Minutes </w:t>
             </w:r>
             <w:r>
               <w:rPr>
@@ -1274,26 +1230,18 @@
               <w:rPr>
                 <w:rFonts w:ascii="Calibri" w:hAnsi="Calibri" w:cs="Calibri"/>
               </w:rPr>
-              <w:t xml:space="preserve"> All Team members</w:t>
-            </w:r>
-          </w:p>
-          <w:p>
-            <w:pPr>
-              <w:rPr>
-                <w:rFonts w:ascii="Calibri" w:hAnsi="Calibri" w:cs="Calibri"/>
-              </w:rPr>
-            </w:pPr>
+              <w:t xml:space="preserve"> </w:t>
+            </w:r>
+            <w:r>
+              <w:rPr>
+                <w:rFonts w:ascii="Calibri" w:hAnsi="Calibri" w:cs="Calibri"/>
+              </w:rPr>
+              <w:t>Project Team</w:t>
+            </w:r>
           </w:p>
         </w:tc>
       </w:tr>
     </w:tbl>
-    <w:p>
-      <w:pPr>
-        <w:rPr>
-          <w:rFonts w:ascii="Calibri" w:hAnsi="Calibri" w:cs="Calibri"/>
-        </w:rPr>
-      </w:pPr>
-    </w:p>
     <w:p>
       <w:pPr>
         <w:rPr>
@@ -1469,7 +1417,7 @@
               <w:rPr>
                 <w:rFonts w:ascii="Calibri" w:hAnsi="Calibri" w:cs="Calibri"/>
               </w:rPr>
-              <w:t>Introduction to attendees/ stakeholders</w:t>
+              <w:t>Introduction to attendees/stakeholders</w:t>
             </w:r>
           </w:p>
         </w:tc>
@@ -1623,7 +1571,19 @@
               <w:rPr>
                 <w:rFonts w:ascii="Calibri" w:hAnsi="Calibri" w:cs="Calibri"/>
               </w:rPr>
-              <w:t>Review of Project-related documents (Business case, Project Charter)</w:t>
+              <w:t xml:space="preserve">Review of Project-related documents (Business </w:t>
+            </w:r>
+            <w:r>
+              <w:rPr>
+                <w:rFonts w:ascii="Calibri" w:hAnsi="Calibri" w:cs="Calibri"/>
+              </w:rPr>
+              <w:t>C</w:t>
+            </w:r>
+            <w:r>
+              <w:rPr>
+                <w:rFonts w:ascii="Calibri" w:hAnsi="Calibri" w:cs="Calibri"/>
+              </w:rPr>
+              <w:t>ase, Project Charter)</w:t>
             </w:r>
           </w:p>
         </w:tc>
@@ -1783,7 +1743,7 @@
               <w:rPr>
                 <w:rFonts w:ascii="Calibri" w:hAnsi="Calibri" w:cs="Calibri"/>
               </w:rPr>
-              <w:t>Discussion of project scope, time, cost, and goals/ objective</w:t>
+              <w:t>Discussion of project scope, time, cost, and goals/objective</w:t>
             </w:r>
           </w:p>
         </w:tc>
@@ -2001,35 +1961,7 @@
           <w:rFonts w:ascii="Calibri" w:hAnsi="Calibri" w:cs="Calibri"/>
           <w:b/>
         </w:rPr>
-        <w:t xml:space="preserve">Open Action Items/Action Items </w:t>
-      </w:r>
-      <w:r>
-        <w:rPr>
-          <w:rFonts w:ascii="Calibri" w:hAnsi="Calibri" w:cs="Calibri"/>
-          <w:b/>
-        </w:rPr>
-        <w:t>f</w:t>
-      </w:r>
-      <w:r>
-        <w:rPr>
-          <w:rFonts w:ascii="Calibri" w:hAnsi="Calibri" w:cs="Calibri"/>
-          <w:b/>
-        </w:rPr>
-        <w:t xml:space="preserve">rom </w:t>
-      </w:r>
-      <w:r>
-        <w:rPr>
-          <w:rFonts w:ascii="Calibri" w:hAnsi="Calibri" w:cs="Calibri"/>
-          <w:b/>
-        </w:rPr>
-        <w:t xml:space="preserve">the </w:t>
-      </w:r>
-      <w:r>
-        <w:rPr>
-          <w:rFonts w:ascii="Calibri" w:hAnsi="Calibri" w:cs="Calibri"/>
-          <w:b/>
-        </w:rPr>
-        <w:t>Previous Meeting</w:t>
+        <w:t>Open Action Items/Action Items from the Previous Meeting</w:t>
       </w:r>
     </w:p>
     <w:p>
@@ -2226,14 +2158,7 @@
           <w:rFonts w:ascii="Calibri" w:hAnsi="Calibri" w:cs="Calibri"/>
           <w:b/>
         </w:rPr>
-        <w:t xml:space="preserve">Discussion </w:t>
-      </w:r>
-      <w:r>
-        <w:rPr>
-          <w:rFonts w:ascii="Calibri" w:hAnsi="Calibri" w:cs="Calibri"/>
-          <w:b/>
-        </w:rPr>
-        <w:t>and Decisions</w:t>
+        <w:t>Discussion and Decisions</w:t>
       </w:r>
     </w:p>
     <w:p>
@@ -2266,7 +2191,6 @@
           <w:tcPr>
             <w:tcW w:w="540" w:type="dxa"/>
             <w:shd w:val="clear" w:color="auto" w:fill="D9D9D9"/>
-            <w:vAlign w:val="center"/>
           </w:tcPr>
           <w:p>
             <w:pPr>
@@ -2302,14 +2226,7 @@
                 <w:rFonts w:ascii="Calibri" w:hAnsi="Calibri" w:cs="Calibri"/>
                 <w:b/>
               </w:rPr>
-              <w:t xml:space="preserve">Discussion </w:t>
-            </w:r>
-            <w:r>
-              <w:rPr>
-                <w:rFonts w:ascii="Calibri" w:hAnsi="Calibri" w:cs="Calibri"/>
-                <w:b/>
-              </w:rPr>
-              <w:t>and Decisions</w:t>
+              <w:t>Discussion and Decisions</w:t>
             </w:r>
           </w:p>
         </w:tc>
@@ -2318,7 +2235,6 @@
         <w:tc>
           <w:tcPr>
             <w:tcW w:w="540" w:type="dxa"/>
-            <w:vAlign w:val="center"/>
           </w:tcPr>
           <w:p>
             <w:pPr>
@@ -2377,7 +2293,6 @@
         <w:tc>
           <w:tcPr>
             <w:tcW w:w="540" w:type="dxa"/>
-            <w:vAlign w:val="center"/>
           </w:tcPr>
           <w:p>
             <w:pPr>
@@ -2539,21 +2454,7 @@
               <w:rPr>
                 <w:rFonts w:ascii="Calibri" w:hAnsi="Calibri" w:cs="Calibri"/>
               </w:rPr>
-              <w:t xml:space="preserve"> Systems </w:t>
-            </w:r>
-            <w:proofErr w:type="gramStart"/>
-            <w:r>
-              <w:rPr>
-                <w:rFonts w:ascii="Calibri" w:hAnsi="Calibri" w:cs="Calibri"/>
-              </w:rPr>
-              <w:t>similar to</w:t>
-            </w:r>
-            <w:proofErr w:type="gramEnd"/>
-            <w:r>
-              <w:rPr>
-                <w:rFonts w:ascii="Calibri" w:hAnsi="Calibri" w:cs="Calibri"/>
-              </w:rPr>
-              <w:t xml:space="preserve"> other groups which are:  </w:t>
+              <w:t xml:space="preserve"> Systems similar to other groups which are:  </w:t>
             </w:r>
           </w:p>
           <w:p>
@@ -2638,7 +2539,7 @@
               <w:rPr>
                 <w:rFonts w:ascii="Calibri" w:hAnsi="Calibri" w:cs="Calibri"/>
               </w:rPr>
-              <w:t>Win Phyo</w:t>
+              <w:t>Win</w:t>
             </w:r>
             <w:r>
               <w:rPr>
@@ -2650,7 +2551,7 @@
               <w:rPr>
                 <w:rFonts w:ascii="Calibri" w:hAnsi="Calibri" w:cs="Calibri"/>
               </w:rPr>
-              <w:t>Zafar</w:t>
+              <w:t>Zaf</w:t>
             </w:r>
             <w:r>
               <w:rPr>
@@ -2675,7 +2576,6 @@
               <w:rPr>
                 <w:rFonts w:ascii="Calibri" w:hAnsi="Calibri" w:cs="Calibri"/>
               </w:rPr>
-              <w:lastRenderedPageBreak/>
               <w:t xml:space="preserve">IPv6 Testing members: </w:t>
             </w:r>
           </w:p>
@@ -2786,19 +2686,32 @@
               <w:rPr>
                 <w:rFonts w:ascii="Calibri" w:hAnsi="Calibri" w:cs="Calibri"/>
               </w:rPr>
-              <w:t xml:space="preserve"> is satisfied with the results </w:t>
-            </w:r>
-            <w:r>
-              <w:rPr>
-                <w:rFonts w:ascii="Calibri" w:hAnsi="Calibri" w:cs="Calibri"/>
-              </w:rPr>
-              <w:sym w:font="Wingdings" w:char="F0E0"/>
-            </w:r>
-            <w:r>
-              <w:rPr>
-                <w:rFonts w:ascii="Calibri" w:hAnsi="Calibri" w:cs="Calibri"/>
-              </w:rPr>
-              <w:t xml:space="preserve"> we will continue onwards with IPv6 and carry out the results for another OS</w:t>
+              <w:t xml:space="preserve"> is satisfied with the results</w:t>
+            </w:r>
+            <w:r>
+              <w:rPr>
+                <w:rFonts w:ascii="Calibri" w:hAnsi="Calibri" w:cs="Calibri"/>
+              </w:rPr>
+              <w:t>,</w:t>
+            </w:r>
+            <w:r>
+              <w:rPr>
+                <w:rFonts w:ascii="Calibri" w:hAnsi="Calibri" w:cs="Calibri"/>
+              </w:rPr>
+              <w:t xml:space="preserve"> we will continue onwards with IPv6 and carry out the </w:t>
+            </w:r>
+            <w:r>
+              <w:rPr>
+                <w:rFonts w:ascii="Calibri" w:hAnsi="Calibri" w:cs="Calibri"/>
+              </w:rPr>
+              <w:lastRenderedPageBreak/>
+              <w:t>results for another OS</w:t>
+            </w:r>
+            <w:r>
+              <w:rPr>
+                <w:rFonts w:ascii="Calibri" w:hAnsi="Calibri" w:cs="Calibri"/>
+              </w:rPr>
+              <w:t>.</w:t>
             </w:r>
           </w:p>
           <w:p>
@@ -2910,7 +2823,6 @@
         <w:tc>
           <w:tcPr>
             <w:tcW w:w="540" w:type="dxa"/>
-            <w:vAlign w:val="center"/>
           </w:tcPr>
           <w:p>
             <w:pPr>
@@ -3100,7 +3012,6 @@
         <w:tc>
           <w:tcPr>
             <w:tcW w:w="540" w:type="dxa"/>
-            <w:vAlign w:val="center"/>
           </w:tcPr>
           <w:p>
             <w:pPr>
@@ -3211,7 +3122,6 @@
         <w:tc>
           <w:tcPr>
             <w:tcW w:w="540" w:type="dxa"/>
-            <w:vAlign w:val="center"/>
           </w:tcPr>
           <w:p>
             <w:pPr>
@@ -3279,7 +3189,6 @@
         <w:tc>
           <w:tcPr>
             <w:tcW w:w="540" w:type="dxa"/>
-            <w:vAlign w:val="center"/>
           </w:tcPr>
           <w:p>
             <w:pPr>
@@ -3330,7 +3239,6 @@
         <w:tc>
           <w:tcPr>
             <w:tcW w:w="540" w:type="dxa"/>
-            <w:vAlign w:val="center"/>
           </w:tcPr>
           <w:p>
             <w:pPr>
@@ -3393,12 +3301,6 @@
                 <w:rFonts w:ascii="Calibri" w:hAnsi="Calibri" w:cs="Calibri"/>
               </w:rPr>
               <w:br/>
-            </w:r>
-            <w:r>
-              <w:rPr>
-                <w:rFonts w:ascii="Calibri" w:hAnsi="Calibri" w:cs="Calibri"/>
-              </w:rPr>
-              <w:lastRenderedPageBreak/>
               <w:t xml:space="preserve">The project Proposal should only be 10 pages, and any other documents should be attached in the Appendix. </w:t>
             </w:r>
           </w:p>
@@ -3433,14 +3335,7 @@
           <w:rFonts w:ascii="Calibri" w:hAnsi="Calibri" w:cs="Calibri"/>
           <w:b/>
         </w:rPr>
-        <w:t xml:space="preserve">Summary of </w:t>
-      </w:r>
-      <w:r>
-        <w:rPr>
-          <w:rFonts w:ascii="Calibri" w:hAnsi="Calibri" w:cs="Calibri"/>
-          <w:b/>
-        </w:rPr>
-        <w:t>Action Items</w:t>
+        <w:t>Summary of Action Items</w:t>
       </w:r>
     </w:p>
     <w:p>
@@ -3551,7 +3446,15 @@
                 <w:rFonts w:ascii="Calibri" w:hAnsi="Calibri" w:cs="Calibri"/>
                 <w:b/>
               </w:rPr>
-              <w:t>Expected Completion Date</w:t>
+              <w:t xml:space="preserve">Expected Completion </w:t>
+            </w:r>
+            <w:r>
+              <w:rPr>
+                <w:rFonts w:ascii="Calibri" w:hAnsi="Calibri" w:cs="Calibri"/>
+                <w:b/>
+              </w:rPr>
+              <w:lastRenderedPageBreak/>
+              <w:t>Date</w:t>
             </w:r>
           </w:p>
         </w:tc>
@@ -3569,65 +3472,6 @@
                 <w:numId w:val="20"/>
               </w:numPr>
               <w:ind w:left="346"/>
-              <w:rPr>
-                <w:rFonts w:ascii="Calibri" w:hAnsi="Calibri" w:cs="Calibri"/>
-              </w:rPr>
-            </w:pPr>
-          </w:p>
-        </w:tc>
-        <w:tc>
-          <w:tcPr>
-            <w:tcW w:w="5400" w:type="dxa"/>
-            <w:vAlign w:val="center"/>
-          </w:tcPr>
-          <w:p>
-            <w:pPr>
-              <w:rPr>
-                <w:rFonts w:ascii="Calibri" w:hAnsi="Calibri" w:cs="Calibri"/>
-              </w:rPr>
-            </w:pPr>
-          </w:p>
-        </w:tc>
-        <w:tc>
-          <w:tcPr>
-            <w:tcW w:w="1530" w:type="dxa"/>
-            <w:vAlign w:val="center"/>
-          </w:tcPr>
-          <w:p>
-            <w:pPr>
-              <w:rPr>
-                <w:rFonts w:ascii="Calibri" w:hAnsi="Calibri" w:cs="Calibri"/>
-              </w:rPr>
-            </w:pPr>
-          </w:p>
-        </w:tc>
-        <w:tc>
-          <w:tcPr>
-            <w:tcW w:w="2520" w:type="dxa"/>
-            <w:vAlign w:val="center"/>
-          </w:tcPr>
-          <w:p>
-            <w:pPr>
-              <w:rPr>
-                <w:rFonts w:ascii="Calibri" w:hAnsi="Calibri" w:cs="Calibri"/>
-              </w:rPr>
-            </w:pPr>
-          </w:p>
-        </w:tc>
-      </w:tr>
-      <w:tr>
-        <w:tc>
-          <w:tcPr>
-            <w:tcW w:w="540" w:type="dxa"/>
-            <w:vAlign w:val="center"/>
-          </w:tcPr>
-          <w:p>
-            <w:pPr>
-              <w:numPr>
-                <w:ilvl w:val="0"/>
-                <w:numId w:val="20"/>
-              </w:numPr>
-              <w:ind w:left="342"/>
               <w:rPr>
                 <w:rFonts w:ascii="Calibri" w:hAnsi="Calibri" w:cs="Calibri"/>
               </w:rPr>
@@ -4041,74 +3885,6 @@
                 <w:numId w:val="17"/>
               </w:numPr>
               <w:ind w:left="245" w:hanging="202"/>
-              <w:rPr>
-                <w:rFonts w:ascii="Calibri" w:hAnsi="Calibri" w:cs="Calibri"/>
-              </w:rPr>
-            </w:pPr>
-          </w:p>
-        </w:tc>
-        <w:tc>
-          <w:tcPr>
-            <w:tcW w:w="9450" w:type="dxa"/>
-            <w:gridSpan w:val="2"/>
-            <w:vAlign w:val="center"/>
-          </w:tcPr>
-          <w:p>
-            <w:pPr>
-              <w:rPr>
-                <w:rFonts w:ascii="Calibri" w:hAnsi="Calibri" w:cs="Calibri"/>
-              </w:rPr>
-            </w:pPr>
-          </w:p>
-        </w:tc>
-      </w:tr>
-      <w:tr>
-        <w:tc>
-          <w:tcPr>
-            <w:tcW w:w="540" w:type="dxa"/>
-            <w:vAlign w:val="center"/>
-          </w:tcPr>
-          <w:p>
-            <w:pPr>
-              <w:numPr>
-                <w:ilvl w:val="0"/>
-                <w:numId w:val="17"/>
-              </w:numPr>
-              <w:ind w:left="252" w:hanging="208"/>
-              <w:rPr>
-                <w:rFonts w:ascii="Calibri" w:hAnsi="Calibri" w:cs="Calibri"/>
-              </w:rPr>
-            </w:pPr>
-          </w:p>
-        </w:tc>
-        <w:tc>
-          <w:tcPr>
-            <w:tcW w:w="9450" w:type="dxa"/>
-            <w:gridSpan w:val="2"/>
-            <w:vAlign w:val="center"/>
-          </w:tcPr>
-          <w:p>
-            <w:pPr>
-              <w:rPr>
-                <w:rFonts w:ascii="Calibri" w:hAnsi="Calibri" w:cs="Calibri"/>
-              </w:rPr>
-            </w:pPr>
-          </w:p>
-        </w:tc>
-      </w:tr>
-      <w:tr>
-        <w:tc>
-          <w:tcPr>
-            <w:tcW w:w="540" w:type="dxa"/>
-            <w:vAlign w:val="center"/>
-          </w:tcPr>
-          <w:p>
-            <w:pPr>
-              <w:numPr>
-                <w:ilvl w:val="0"/>
-                <w:numId w:val="17"/>
-              </w:numPr>
-              <w:ind w:left="252" w:hanging="208"/>
               <w:rPr>
                 <w:rFonts w:ascii="Calibri" w:hAnsi="Calibri" w:cs="Calibri"/>
               </w:rPr>

</xml_diff>

<commit_message>
Update all Meeting Minutes to v1.1
</commit_message>
<xml_diff>
--- a/03-Communication-and-Teamwork/Meetings/Minutes/Mentor-Client-Meetings/Meeting Minutes 2025-03-20 (Client Kick-off).docx
+++ b/03-Communication-and-Teamwork/Meetings/Minutes/Mentor-Client-Meetings/Meeting Minutes 2025-03-20 (Client Kick-off).docx
@@ -4,13 +4,6 @@
   <w:body>
     <w:p>
       <w:pPr>
-        <w:rPr>
-          <w:rFonts w:ascii="Calibri" w:hAnsi="Calibri" w:cs="Calibri"/>
-        </w:rPr>
-      </w:pPr>
-    </w:p>
-    <w:p>
-      <w:pPr>
         <w:jc w:val="center"/>
         <w:rPr>
           <w:rFonts w:ascii="Calibri" w:hAnsi="Calibri" w:cs="Calibri"/>
@@ -22,7 +15,21 @@
           <w:rFonts w:ascii="Calibri" w:hAnsi="Calibri" w:cs="Calibri"/>
           <w:b/>
         </w:rPr>
-        <w:t>Mentor / Client Meeting</w:t>
+        <w:t>Client</w:t>
+      </w:r>
+      <w:r>
+        <w:rPr>
+          <w:rFonts w:ascii="Calibri" w:hAnsi="Calibri" w:cs="Calibri"/>
+          <w:b/>
+        </w:rPr>
+        <w:t>/</w:t>
+      </w:r>
+      <w:r>
+        <w:rPr>
+          <w:rFonts w:ascii="Calibri" w:hAnsi="Calibri" w:cs="Calibri"/>
+          <w:b/>
+        </w:rPr>
+        <w:t>Mentor Meeting</w:t>
       </w:r>
     </w:p>
     <w:p>
@@ -203,7 +210,35 @@
                 <w:rFonts w:ascii="Calibri" w:hAnsi="Calibri" w:cs="Calibri"/>
                 <w:b/>
               </w:rPr>
-              <w:t>Meeting with mentor/client to figure out what the project requires</w:t>
+              <w:t xml:space="preserve">Meeting with </w:t>
+            </w:r>
+            <w:r>
+              <w:rPr>
+                <w:rFonts w:ascii="Calibri" w:hAnsi="Calibri" w:cs="Calibri"/>
+                <w:b/>
+              </w:rPr>
+              <w:t>C</w:t>
+            </w:r>
+            <w:r>
+              <w:rPr>
+                <w:rFonts w:ascii="Calibri" w:hAnsi="Calibri" w:cs="Calibri"/>
+                <w:b/>
+              </w:rPr>
+              <w:t>lient</w:t>
+            </w:r>
+            <w:r>
+              <w:rPr>
+                <w:rFonts w:ascii="Calibri" w:hAnsi="Calibri" w:cs="Calibri"/>
+                <w:b/>
+              </w:rPr>
+              <w:t>/Mentor</w:t>
+            </w:r>
+            <w:r>
+              <w:rPr>
+                <w:rFonts w:ascii="Calibri" w:hAnsi="Calibri" w:cs="Calibri"/>
+                <w:b/>
+              </w:rPr>
+              <w:t xml:space="preserve"> to figure out what the project requires</w:t>
             </w:r>
           </w:p>
         </w:tc>
@@ -470,7 +505,7 @@
                 <w:rFonts w:ascii="Calibri" w:hAnsi="Calibri" w:cs="Calibri"/>
                 <w:bCs/>
               </w:rPr>
-              <w:t>0</w:t>
+              <w:t>1</w:t>
             </w:r>
           </w:p>
         </w:tc>
@@ -644,7 +679,7 @@
               <w:rPr>
                 <w:rFonts w:ascii="Calibri" w:hAnsi="Calibri" w:cs="Calibri"/>
               </w:rPr>
-              <w:t>Thomas Hugh Robinson</w:t>
+              <w:t>Thomas Robinson</w:t>
             </w:r>
           </w:p>
         </w:tc>
@@ -663,7 +698,13 @@
               <w:rPr>
                 <w:rFonts w:ascii="Calibri" w:hAnsi="Calibri" w:cs="Calibri"/>
               </w:rPr>
-              <w:t>Team Leader</w:t>
+              <w:t>Project</w:t>
+            </w:r>
+            <w:r>
+              <w:rPr>
+                <w:rFonts w:ascii="Calibri" w:hAnsi="Calibri" w:cs="Calibri"/>
+              </w:rPr>
+              <w:t xml:space="preserve"> Leader</w:t>
             </w:r>
           </w:p>
         </w:tc>
@@ -702,13 +743,7 @@
               <w:rPr>
                 <w:rFonts w:ascii="Calibri" w:hAnsi="Calibri" w:cs="Calibri"/>
               </w:rPr>
-              <w:t>Team</w:t>
-            </w:r>
-            <w:r>
-              <w:rPr>
-                <w:rFonts w:ascii="Calibri" w:hAnsi="Calibri" w:cs="Calibri"/>
-              </w:rPr>
-              <w:t xml:space="preserve"> Member</w:t>
+              <w:t>Project Member</w:t>
             </w:r>
           </w:p>
         </w:tc>
@@ -746,7 +781,7 @@
               <w:rPr>
                 <w:rFonts w:ascii="Calibri" w:hAnsi="Calibri" w:cs="Calibri"/>
               </w:rPr>
-              <w:t>Team Member</w:t>
+              <w:t>Project Member</w:t>
             </w:r>
           </w:p>
         </w:tc>
@@ -784,7 +819,7 @@
               <w:rPr>
                 <w:rFonts w:ascii="Calibri" w:hAnsi="Calibri" w:cs="Calibri"/>
               </w:rPr>
-              <w:t>Team Member</w:t>
+              <w:t>Project Member</w:t>
             </w:r>
           </w:p>
         </w:tc>
@@ -822,7 +857,7 @@
               <w:rPr>
                 <w:rFonts w:ascii="Calibri" w:hAnsi="Calibri" w:cs="Calibri"/>
               </w:rPr>
-              <w:t>Team Member</w:t>
+              <w:t>Project Member</w:t>
             </w:r>
           </w:p>
         </w:tc>
@@ -860,7 +895,7 @@
               <w:rPr>
                 <w:rFonts w:ascii="Calibri" w:hAnsi="Calibri" w:cs="Calibri"/>
               </w:rPr>
-              <w:t>Team Member</w:t>
+              <w:t>Project Member</w:t>
             </w:r>
           </w:p>
         </w:tc>
@@ -898,7 +933,7 @@
               <w:rPr>
                 <w:rFonts w:ascii="Calibri" w:hAnsi="Calibri" w:cs="Calibri"/>
               </w:rPr>
-              <w:t>Team Member</w:t>
+              <w:t>Project Member</w:t>
             </w:r>
           </w:p>
         </w:tc>
@@ -936,7 +971,13 @@
               <w:rPr>
                 <w:rFonts w:ascii="Calibri" w:hAnsi="Calibri" w:cs="Calibri"/>
               </w:rPr>
-              <w:t>Team Member</w:t>
+              <w:t xml:space="preserve">Project </w:t>
+            </w:r>
+            <w:r>
+              <w:rPr>
+                <w:rFonts w:ascii="Calibri" w:hAnsi="Calibri" w:cs="Calibri"/>
+              </w:rPr>
+              <w:t>Mentor</w:t>
             </w:r>
           </w:p>
         </w:tc>
@@ -1263,6 +1304,14 @@
           <w:rFonts w:ascii="Calibri" w:hAnsi="Calibri" w:cs="Calibri"/>
           <w:b/>
         </w:rPr>
+        <w:br w:type="page"/>
+      </w:r>
+      <w:r>
+        <w:rPr>
+          <w:rFonts w:ascii="Calibri" w:hAnsi="Calibri" w:cs="Calibri"/>
+          <w:b/>
+        </w:rPr>
+        <w:lastRenderedPageBreak/>
         <w:t>Agenda</w:t>
       </w:r>
     </w:p>
@@ -1660,7 +1709,19 @@
               <w:rPr>
                 <w:rFonts w:ascii="Calibri" w:hAnsi="Calibri" w:cs="Calibri"/>
               </w:rPr>
-              <w:t>Discussion of project organizational str</w:t>
+              <w:t>Discussion of project organ</w:t>
+            </w:r>
+            <w:r>
+              <w:rPr>
+                <w:rFonts w:ascii="Calibri" w:hAnsi="Calibri" w:cs="Calibri"/>
+              </w:rPr>
+              <w:t>is</w:t>
+            </w:r>
+            <w:r>
+              <w:rPr>
+                <w:rFonts w:ascii="Calibri" w:hAnsi="Calibri" w:cs="Calibri"/>
+              </w:rPr>
+              <w:t>ational str</w:t>
             </w:r>
             <w:r>
               <w:rPr>
@@ -2284,7 +2345,19 @@
               <w:rPr>
                 <w:rFonts w:ascii="Calibri" w:hAnsi="Calibri" w:cs="Calibri"/>
               </w:rPr>
-              <w:t xml:space="preserve">New Team member – Kylie Afable </w:t>
+              <w:t xml:space="preserve">New </w:t>
+            </w:r>
+            <w:r>
+              <w:rPr>
+                <w:rFonts w:ascii="Calibri" w:hAnsi="Calibri" w:cs="Calibri"/>
+              </w:rPr>
+              <w:t>t</w:t>
+            </w:r>
+            <w:r>
+              <w:rPr>
+                <w:rFonts w:ascii="Calibri" w:hAnsi="Calibri" w:cs="Calibri"/>
+              </w:rPr>
+              <w:t xml:space="preserve">eam member – Kylie Afable </w:t>
             </w:r>
           </w:p>
         </w:tc>
@@ -2345,6 +2418,12 @@
               </w:rPr>
               <w:t>Physical environment</w:t>
             </w:r>
+            <w:r>
+              <w:rPr>
+                <w:rFonts w:ascii="Calibri" w:hAnsi="Calibri" w:cs="Calibri"/>
+              </w:rPr>
+              <w:t>.</w:t>
+            </w:r>
           </w:p>
           <w:p>
             <w:pPr>
@@ -2368,8 +2447,21 @@
               <w:rPr>
                 <w:rFonts w:ascii="Calibri" w:hAnsi="Calibri" w:cs="Calibri"/>
               </w:rPr>
-              <w:t xml:space="preserve"> 4 computers </w:t>
-            </w:r>
+              <w:t xml:space="preserve"> 4 computers</w:t>
+            </w:r>
+            <w:r>
+              <w:rPr>
+                <w:rFonts w:ascii="Calibri" w:hAnsi="Calibri" w:cs="Calibri"/>
+              </w:rPr>
+              <w:t>.</w:t>
+            </w:r>
+          </w:p>
+          <w:p>
+            <w:pPr>
+              <w:rPr>
+                <w:rFonts w:ascii="Calibri" w:hAnsi="Calibri" w:cs="Calibri"/>
+              </w:rPr>
+            </w:pPr>
           </w:p>
           <w:p>
             <w:pPr>
@@ -2401,67 +2493,20 @@
               <w:rPr>
                 <w:rFonts w:ascii="Calibri" w:hAnsi="Calibri" w:cs="Calibri"/>
               </w:rPr>
-              <w:t xml:space="preserve">There will be three networks </w:t>
-            </w:r>
-          </w:p>
-          <w:p>
-            <w:pPr>
-              <w:ind w:left="720"/>
-              <w:rPr>
-                <w:rFonts w:ascii="Calibri" w:hAnsi="Calibri" w:cs="Calibri"/>
-              </w:rPr>
-            </w:pPr>
-            <w:r>
-              <w:rPr>
-                <w:rFonts w:ascii="Calibri" w:hAnsi="Calibri" w:cs="Calibri"/>
-              </w:rPr>
-              <w:t xml:space="preserve">Network 1 – Sender to R1 </w:t>
-            </w:r>
-            <w:r>
-              <w:rPr>
-                <w:rFonts w:ascii="Calibri" w:hAnsi="Calibri" w:cs="Calibri"/>
-              </w:rPr>
-              <w:br/>
-              <w:t xml:space="preserve">Network 2 – R1 to R2 </w:t>
-            </w:r>
-            <w:r>
-              <w:rPr>
-                <w:rFonts w:ascii="Calibri" w:hAnsi="Calibri" w:cs="Calibri"/>
-              </w:rPr>
-              <w:br/>
-              <w:t xml:space="preserve">Network 3 – R2 to Receiver </w:t>
-            </w:r>
-          </w:p>
-          <w:p>
-            <w:pPr>
-              <w:rPr>
-                <w:rFonts w:ascii="Calibri" w:hAnsi="Calibri" w:cs="Calibri"/>
-              </w:rPr>
-            </w:pPr>
-            <w:r>
-              <w:rPr>
-                <w:rFonts w:ascii="Calibri" w:hAnsi="Calibri" w:cs="Calibri"/>
-              </w:rPr>
-              <w:t xml:space="preserve">We were told to use </w:t>
-            </w:r>
-            <w:r>
-              <w:rPr>
-                <w:rFonts w:ascii="Calibri" w:hAnsi="Calibri" w:cs="Calibri"/>
-              </w:rPr>
-              <w:t>Operating</w:t>
-            </w:r>
-            <w:r>
-              <w:rPr>
-                <w:rFonts w:ascii="Calibri" w:hAnsi="Calibri" w:cs="Calibri"/>
-              </w:rPr>
-              <w:t xml:space="preserve"> Systems similar to other groups which are:  </w:t>
+              <w:t>There will be three networks</w:t>
+            </w:r>
+            <w:r>
+              <w:rPr>
+                <w:rFonts w:ascii="Calibri" w:hAnsi="Calibri" w:cs="Calibri"/>
+              </w:rPr>
+              <w:t>:</w:t>
             </w:r>
           </w:p>
           <w:p>
             <w:pPr>
               <w:numPr>
                 <w:ilvl w:val="0"/>
-                <w:numId w:val="24"/>
+                <w:numId w:val="28"/>
               </w:numPr>
               <w:rPr>
                 <w:rFonts w:ascii="Calibri" w:hAnsi="Calibri" w:cs="Calibri"/>
@@ -2471,65 +2516,14 @@
               <w:rPr>
                 <w:rFonts w:ascii="Calibri" w:hAnsi="Calibri" w:cs="Calibri"/>
               </w:rPr>
-              <w:t>Fedora</w:t>
-            </w:r>
-            <w:r>
-              <w:rPr>
-                <w:rFonts w:ascii="Calibri" w:hAnsi="Calibri" w:cs="Calibri"/>
-              </w:rPr>
-              <w:t xml:space="preserve">, </w:t>
-            </w:r>
-            <w:r>
-              <w:rPr>
-                <w:rFonts w:ascii="Calibri" w:hAnsi="Calibri" w:cs="Calibri"/>
-              </w:rPr>
-              <w:t>Ubuntu</w:t>
-            </w:r>
-            <w:r>
-              <w:rPr>
-                <w:rFonts w:ascii="Calibri" w:hAnsi="Calibri" w:cs="Calibri"/>
-              </w:rPr>
-              <w:t xml:space="preserve">, </w:t>
-            </w:r>
-            <w:r>
-              <w:rPr>
-                <w:rFonts w:ascii="Calibri" w:hAnsi="Calibri" w:cs="Calibri"/>
-              </w:rPr>
-              <w:t>Kali Linux</w:t>
-            </w:r>
-          </w:p>
-          <w:p>
-            <w:pPr>
-              <w:rPr>
-                <w:rFonts w:ascii="Calibri" w:hAnsi="Calibri" w:cs="Calibri"/>
-              </w:rPr>
-            </w:pPr>
-          </w:p>
-          <w:p>
-            <w:pPr>
-              <w:rPr>
-                <w:rFonts w:ascii="Calibri" w:hAnsi="Calibri" w:cs="Calibri"/>
-              </w:rPr>
-            </w:pPr>
-            <w:r>
-              <w:rPr>
-                <w:rFonts w:ascii="Calibri" w:hAnsi="Calibri" w:cs="Calibri"/>
-              </w:rPr>
-              <w:t>Testing on IPv4 first on TCP and then UDP</w:t>
-            </w:r>
-            <w:r>
-              <w:rPr>
-                <w:rFonts w:ascii="Calibri" w:hAnsi="Calibri" w:cs="Calibri"/>
-              </w:rPr>
-              <w:br/>
-              <w:t xml:space="preserve">IPv4 Testing members: </w:t>
+              <w:t>Network 1 – Sender to R1</w:t>
             </w:r>
           </w:p>
           <w:p>
             <w:pPr>
               <w:numPr>
                 <w:ilvl w:val="0"/>
-                <w:numId w:val="22"/>
+                <w:numId w:val="28"/>
               </w:numPr>
               <w:rPr>
                 <w:rFonts w:ascii="Calibri" w:hAnsi="Calibri" w:cs="Calibri"/>
@@ -2539,51 +2533,14 @@
               <w:rPr>
                 <w:rFonts w:ascii="Calibri" w:hAnsi="Calibri" w:cs="Calibri"/>
               </w:rPr>
-              <w:t>Win</w:t>
-            </w:r>
-            <w:r>
-              <w:rPr>
-                <w:rFonts w:ascii="Calibri" w:hAnsi="Calibri" w:cs="Calibri"/>
-              </w:rPr>
-              <w:t xml:space="preserve">, </w:t>
-            </w:r>
-            <w:r>
-              <w:rPr>
-                <w:rFonts w:ascii="Calibri" w:hAnsi="Calibri" w:cs="Calibri"/>
-              </w:rPr>
-              <w:t>Zaf</w:t>
-            </w:r>
-            <w:r>
-              <w:rPr>
-                <w:rFonts w:ascii="Calibri" w:hAnsi="Calibri" w:cs="Calibri"/>
-              </w:rPr>
-              <w:t xml:space="preserve">, </w:t>
-            </w:r>
-            <w:r>
-              <w:rPr>
-                <w:rFonts w:ascii="Calibri" w:hAnsi="Calibri" w:cs="Calibri"/>
-              </w:rPr>
-              <w:t>Thomas</w:t>
-            </w:r>
-          </w:p>
-          <w:p>
-            <w:pPr>
-              <w:rPr>
-                <w:rFonts w:ascii="Calibri" w:hAnsi="Calibri" w:cs="Calibri"/>
-              </w:rPr>
-            </w:pPr>
-            <w:r>
-              <w:rPr>
-                <w:rFonts w:ascii="Calibri" w:hAnsi="Calibri" w:cs="Calibri"/>
-              </w:rPr>
-              <w:t xml:space="preserve">IPv6 Testing members: </w:t>
+              <w:t>Network 2 – R1 to R2</w:t>
             </w:r>
           </w:p>
           <w:p>
             <w:pPr>
               <w:numPr>
                 <w:ilvl w:val="0"/>
-                <w:numId w:val="22"/>
+                <w:numId w:val="28"/>
               </w:numPr>
               <w:rPr>
                 <w:rFonts w:ascii="Calibri" w:hAnsi="Calibri" w:cs="Calibri"/>
@@ -2593,6 +2550,197 @@
               <w:rPr>
                 <w:rFonts w:ascii="Calibri" w:hAnsi="Calibri" w:cs="Calibri"/>
               </w:rPr>
+              <w:t>Network 3 – R2 to Receiver</w:t>
+            </w:r>
+          </w:p>
+          <w:p>
+            <w:pPr>
+              <w:rPr>
+                <w:rFonts w:ascii="Calibri" w:hAnsi="Calibri" w:cs="Calibri"/>
+              </w:rPr>
+            </w:pPr>
+          </w:p>
+          <w:p>
+            <w:pPr>
+              <w:rPr>
+                <w:rFonts w:ascii="Calibri" w:hAnsi="Calibri" w:cs="Calibri"/>
+              </w:rPr>
+            </w:pPr>
+            <w:r>
+              <w:rPr>
+                <w:rFonts w:ascii="Calibri" w:hAnsi="Calibri" w:cs="Calibri"/>
+              </w:rPr>
+              <w:t xml:space="preserve">We were told to use </w:t>
+            </w:r>
+            <w:r>
+              <w:rPr>
+                <w:rFonts w:ascii="Calibri" w:hAnsi="Calibri" w:cs="Calibri"/>
+              </w:rPr>
+              <w:t>Operating</w:t>
+            </w:r>
+            <w:r>
+              <w:rPr>
+                <w:rFonts w:ascii="Calibri" w:hAnsi="Calibri" w:cs="Calibri"/>
+              </w:rPr>
+              <w:t xml:space="preserve"> Systems similar to other groups which are:  </w:t>
+            </w:r>
+          </w:p>
+          <w:p>
+            <w:pPr>
+              <w:numPr>
+                <w:ilvl w:val="0"/>
+                <w:numId w:val="27"/>
+              </w:numPr>
+              <w:rPr>
+                <w:rFonts w:ascii="Calibri" w:hAnsi="Calibri" w:cs="Calibri"/>
+              </w:rPr>
+            </w:pPr>
+            <w:r>
+              <w:rPr>
+                <w:rFonts w:ascii="Calibri" w:hAnsi="Calibri" w:cs="Calibri"/>
+              </w:rPr>
+              <w:t>Fedora</w:t>
+            </w:r>
+            <w:r>
+              <w:rPr>
+                <w:rFonts w:ascii="Calibri" w:hAnsi="Calibri" w:cs="Calibri"/>
+              </w:rPr>
+              <w:t xml:space="preserve">, </w:t>
+            </w:r>
+            <w:r>
+              <w:rPr>
+                <w:rFonts w:ascii="Calibri" w:hAnsi="Calibri" w:cs="Calibri"/>
+              </w:rPr>
+              <w:t>Ubuntu</w:t>
+            </w:r>
+            <w:r>
+              <w:rPr>
+                <w:rFonts w:ascii="Calibri" w:hAnsi="Calibri" w:cs="Calibri"/>
+              </w:rPr>
+              <w:t xml:space="preserve">, </w:t>
+            </w:r>
+            <w:r>
+              <w:rPr>
+                <w:rFonts w:ascii="Calibri" w:hAnsi="Calibri" w:cs="Calibri"/>
+              </w:rPr>
+              <w:t>Kali Linux</w:t>
+            </w:r>
+          </w:p>
+          <w:p>
+            <w:pPr>
+              <w:rPr>
+                <w:rFonts w:ascii="Calibri" w:hAnsi="Calibri" w:cs="Calibri"/>
+              </w:rPr>
+            </w:pPr>
+          </w:p>
+          <w:p>
+            <w:pPr>
+              <w:rPr>
+                <w:rFonts w:ascii="Calibri" w:hAnsi="Calibri" w:cs="Calibri"/>
+              </w:rPr>
+            </w:pPr>
+            <w:r>
+              <w:rPr>
+                <w:rFonts w:ascii="Calibri" w:hAnsi="Calibri" w:cs="Calibri"/>
+              </w:rPr>
+              <w:lastRenderedPageBreak/>
+              <w:t>Testing on IPv4 first on TCP and then UDP</w:t>
+            </w:r>
+            <w:r>
+              <w:rPr>
+                <w:rFonts w:ascii="Calibri" w:hAnsi="Calibri" w:cs="Calibri"/>
+              </w:rPr>
+              <w:t>.</w:t>
+            </w:r>
+          </w:p>
+          <w:p>
+            <w:pPr>
+              <w:rPr>
+                <w:rFonts w:ascii="Calibri" w:hAnsi="Calibri" w:cs="Calibri"/>
+              </w:rPr>
+            </w:pPr>
+          </w:p>
+          <w:p>
+            <w:pPr>
+              <w:rPr>
+                <w:rFonts w:ascii="Calibri" w:hAnsi="Calibri" w:cs="Calibri"/>
+              </w:rPr>
+            </w:pPr>
+            <w:r>
+              <w:rPr>
+                <w:rFonts w:ascii="Calibri" w:hAnsi="Calibri" w:cs="Calibri"/>
+              </w:rPr>
+              <w:t xml:space="preserve">IPv4 Testing members: </w:t>
+            </w:r>
+          </w:p>
+          <w:p>
+            <w:pPr>
+              <w:numPr>
+                <w:ilvl w:val="0"/>
+                <w:numId w:val="26"/>
+              </w:numPr>
+              <w:rPr>
+                <w:rFonts w:ascii="Calibri" w:hAnsi="Calibri" w:cs="Calibri"/>
+              </w:rPr>
+            </w:pPr>
+            <w:r>
+              <w:rPr>
+                <w:rFonts w:ascii="Calibri" w:hAnsi="Calibri" w:cs="Calibri"/>
+              </w:rPr>
+              <w:t>Win</w:t>
+            </w:r>
+            <w:r>
+              <w:rPr>
+                <w:rFonts w:ascii="Calibri" w:hAnsi="Calibri" w:cs="Calibri"/>
+              </w:rPr>
+              <w:t xml:space="preserve">, </w:t>
+            </w:r>
+            <w:r>
+              <w:rPr>
+                <w:rFonts w:ascii="Calibri" w:hAnsi="Calibri" w:cs="Calibri"/>
+              </w:rPr>
+              <w:t>Zaf</w:t>
+            </w:r>
+            <w:r>
+              <w:rPr>
+                <w:rFonts w:ascii="Calibri" w:hAnsi="Calibri" w:cs="Calibri"/>
+              </w:rPr>
+              <w:t xml:space="preserve">, </w:t>
+            </w:r>
+            <w:r>
+              <w:rPr>
+                <w:rFonts w:ascii="Calibri" w:hAnsi="Calibri" w:cs="Calibri"/>
+              </w:rPr>
+              <w:t>Thomas</w:t>
+            </w:r>
+          </w:p>
+          <w:p>
+            <w:pPr>
+              <w:rPr>
+                <w:rFonts w:ascii="Calibri" w:hAnsi="Calibri" w:cs="Calibri"/>
+              </w:rPr>
+            </w:pPr>
+            <w:r>
+              <w:rPr>
+                <w:rFonts w:ascii="Calibri" w:hAnsi="Calibri" w:cs="Calibri"/>
+              </w:rPr>
+              <w:t xml:space="preserve">IPv6 Testing members: </w:t>
+            </w:r>
+          </w:p>
+          <w:p>
+            <w:pPr>
+              <w:numPr>
+                <w:ilvl w:val="0"/>
+                <w:numId w:val="25"/>
+              </w:numPr>
+              <w:rPr>
+                <w:rFonts w:ascii="Calibri" w:hAnsi="Calibri" w:cs="Calibri"/>
+              </w:rPr>
+            </w:pPr>
+            <w:r>
+              <w:rPr>
+                <w:rFonts w:ascii="Calibri" w:hAnsi="Calibri" w:cs="Calibri"/>
+              </w:rPr>
               <w:t>Larissa, Kylie</w:t>
             </w:r>
             <w:r>
@@ -2654,26 +2802,73 @@
               <w:rPr>
                 <w:rFonts w:ascii="Calibri" w:hAnsi="Calibri" w:cs="Calibri"/>
               </w:rPr>
-              <w:t xml:space="preserve">We will need to have a log file to submit as well as the testing results/ findings in excel file </w:t>
-            </w:r>
-          </w:p>
-          <w:p>
-            <w:pPr>
-              <w:rPr>
-                <w:rFonts w:ascii="Calibri" w:hAnsi="Calibri" w:cs="Calibri"/>
-              </w:rPr>
-            </w:pPr>
-            <w:r>
-              <w:rPr>
-                <w:rFonts w:ascii="Calibri" w:hAnsi="Calibri" w:cs="Calibri"/>
-              </w:rPr>
-              <w:t xml:space="preserve">After testing IPv4, we will need to notify Mentor to meet with the client. </w:t>
+              <w:t xml:space="preserve">We will need to have a log file to submit as well as the testing results/findings in </w:t>
+            </w:r>
+            <w:r>
+              <w:rPr>
+                <w:rFonts w:ascii="Calibri" w:hAnsi="Calibri" w:cs="Calibri"/>
+              </w:rPr>
+              <w:t>an E</w:t>
+            </w:r>
+            <w:r>
+              <w:rPr>
+                <w:rFonts w:ascii="Calibri" w:hAnsi="Calibri" w:cs="Calibri"/>
+              </w:rPr>
+              <w:t>xcel file</w:t>
+            </w:r>
+            <w:r>
+              <w:rPr>
+                <w:rFonts w:ascii="Calibri" w:hAnsi="Calibri" w:cs="Calibri"/>
+              </w:rPr>
+              <w:t>.</w:t>
+            </w:r>
+            <w:r>
+              <w:rPr>
+                <w:rFonts w:ascii="Calibri" w:hAnsi="Calibri" w:cs="Calibri"/>
+              </w:rPr>
+              <w:t xml:space="preserve"> </w:t>
+            </w:r>
+          </w:p>
+          <w:p>
+            <w:pPr>
+              <w:rPr>
+                <w:rFonts w:ascii="Calibri" w:hAnsi="Calibri" w:cs="Calibri"/>
+              </w:rPr>
+            </w:pPr>
+            <w:r>
+              <w:rPr>
+                <w:rFonts w:ascii="Calibri" w:hAnsi="Calibri" w:cs="Calibri"/>
+              </w:rPr>
+              <w:t xml:space="preserve">After testing IPv4, we will need to notify </w:t>
+            </w:r>
+            <w:r>
+              <w:rPr>
+                <w:rFonts w:ascii="Calibri" w:hAnsi="Calibri" w:cs="Calibri"/>
+              </w:rPr>
+              <w:t>m</w:t>
+            </w:r>
+            <w:r>
+              <w:rPr>
+                <w:rFonts w:ascii="Calibri" w:hAnsi="Calibri" w:cs="Calibri"/>
+              </w:rPr>
+              <w:t>entor to meet with the client.</w:t>
+            </w:r>
+            <w:r>
+              <w:rPr>
+                <w:rFonts w:ascii="Calibri" w:hAnsi="Calibri" w:cs="Calibri"/>
+              </w:rPr>
+              <w:t xml:space="preserve"> </w:t>
             </w:r>
             <w:r>
               <w:rPr>
                 <w:rFonts w:ascii="Calibri" w:hAnsi="Calibri" w:cs="Calibri"/>
               </w:rPr>
               <w:br/>
+            </w:r>
+            <w:r>
+              <w:rPr>
+                <w:rFonts w:ascii="Calibri" w:hAnsi="Calibri" w:cs="Calibri"/>
+              </w:rPr>
               <w:t xml:space="preserve">If </w:t>
             </w:r>
             <w:r>
@@ -2704,8 +2899,13 @@
               <w:rPr>
                 <w:rFonts w:ascii="Calibri" w:hAnsi="Calibri" w:cs="Calibri"/>
               </w:rPr>
-              <w:lastRenderedPageBreak/>
-              <w:t>results for another OS</w:t>
+              <w:t>evaluations</w:t>
+            </w:r>
+            <w:r>
+              <w:rPr>
+                <w:rFonts w:ascii="Calibri" w:hAnsi="Calibri" w:cs="Calibri"/>
+              </w:rPr>
+              <w:t xml:space="preserve"> for another OS</w:t>
             </w:r>
             <w:r>
               <w:rPr>
@@ -2720,13 +2920,6 @@
                 <w:rFonts w:ascii="Calibri" w:hAnsi="Calibri" w:cs="Calibri"/>
               </w:rPr>
             </w:pPr>
-          </w:p>
-          <w:p>
-            <w:pPr>
-              <w:rPr>
-                <w:rFonts w:ascii="Calibri" w:hAnsi="Calibri" w:cs="Calibri"/>
-              </w:rPr>
-            </w:pPr>
             <w:r>
               <w:rPr>
                 <w:rFonts w:ascii="Calibri" w:hAnsi="Calibri" w:cs="Calibri"/>
@@ -2739,7 +2932,43 @@
               <w:rPr>
                 <w:rFonts w:ascii="Calibri" w:hAnsi="Calibri" w:cs="Calibri"/>
               </w:rPr>
-              <w:t xml:space="preserve">: We would need to take account for the specification of each hardware and equipment. </w:t>
+              <w:t xml:space="preserve">: We need to take account </w:t>
+            </w:r>
+            <w:r>
+              <w:rPr>
+                <w:rFonts w:ascii="Calibri" w:hAnsi="Calibri" w:cs="Calibri"/>
+              </w:rPr>
+              <w:t>of</w:t>
+            </w:r>
+            <w:r>
+              <w:rPr>
+                <w:rFonts w:ascii="Calibri" w:hAnsi="Calibri" w:cs="Calibri"/>
+              </w:rPr>
+              <w:t xml:space="preserve"> the specification</w:t>
+            </w:r>
+            <w:r>
+              <w:rPr>
+                <w:rFonts w:ascii="Calibri" w:hAnsi="Calibri" w:cs="Calibri"/>
+              </w:rPr>
+              <w:t>s</w:t>
+            </w:r>
+            <w:r>
+              <w:rPr>
+                <w:rFonts w:ascii="Calibri" w:hAnsi="Calibri" w:cs="Calibri"/>
+              </w:rPr>
+              <w:t xml:space="preserve"> of </w:t>
+            </w:r>
+            <w:r>
+              <w:rPr>
+                <w:rFonts w:ascii="Calibri" w:hAnsi="Calibri" w:cs="Calibri"/>
+              </w:rPr>
+              <w:t>all</w:t>
+            </w:r>
+            <w:r>
+              <w:rPr>
+                <w:rFonts w:ascii="Calibri" w:hAnsi="Calibri" w:cs="Calibri"/>
+              </w:rPr>
+              <w:t xml:space="preserve"> hardware and equipment. </w:t>
             </w:r>
             <w:r>
               <w:rPr>
@@ -2786,7 +3015,19 @@
               <w:rPr>
                 <w:rFonts w:ascii="Calibri" w:hAnsi="Calibri" w:cs="Calibri"/>
               </w:rPr>
-              <w:t xml:space="preserve"> to carry out all the testing. They cannot be taken home.</w:t>
+              <w:t xml:space="preserve"> to carry out all the testing. </w:t>
+            </w:r>
+            <w:r>
+              <w:rPr>
+                <w:rFonts w:ascii="Calibri" w:hAnsi="Calibri" w:cs="Calibri"/>
+              </w:rPr>
+              <w:t>It</w:t>
+            </w:r>
+            <w:r>
+              <w:rPr>
+                <w:rFonts w:ascii="Calibri" w:hAnsi="Calibri" w:cs="Calibri"/>
+              </w:rPr>
+              <w:t xml:space="preserve"> cannot be taken home.</w:t>
             </w:r>
           </w:p>
           <w:p>
@@ -2888,20 +3129,38 @@
               <w:rPr>
                 <w:rFonts w:ascii="Calibri" w:hAnsi="Calibri" w:cs="Calibri"/>
               </w:rPr>
-              <w:t xml:space="preserve">Mentor told us that we need to have project methodology set first </w:t>
-            </w:r>
-          </w:p>
-          <w:p>
-            <w:pPr>
-              <w:rPr>
-                <w:rFonts w:ascii="Calibri" w:hAnsi="Calibri" w:cs="Calibri"/>
-              </w:rPr>
-            </w:pPr>
-            <w:r>
-              <w:rPr>
-                <w:rFonts w:ascii="Calibri" w:hAnsi="Calibri" w:cs="Calibri"/>
-              </w:rPr>
-              <w:t xml:space="preserve">Have a table of three project methodology and </w:t>
+              <w:t>Mentor told us that we need to have project methodology set first</w:t>
+            </w:r>
+            <w:r>
+              <w:rPr>
+                <w:rFonts w:ascii="Calibri" w:hAnsi="Calibri" w:cs="Calibri"/>
+              </w:rPr>
+              <w:t>.</w:t>
+            </w:r>
+          </w:p>
+          <w:p>
+            <w:pPr>
+              <w:rPr>
+                <w:rFonts w:ascii="Calibri" w:hAnsi="Calibri" w:cs="Calibri"/>
+              </w:rPr>
+            </w:pPr>
+            <w:r>
+              <w:rPr>
+                <w:rFonts w:ascii="Calibri" w:hAnsi="Calibri" w:cs="Calibri"/>
+              </w:rPr>
+              <w:t>Have a table of three project methodolog</w:t>
+            </w:r>
+            <w:r>
+              <w:rPr>
+                <w:rFonts w:ascii="Calibri" w:hAnsi="Calibri" w:cs="Calibri"/>
+              </w:rPr>
+              <w:t>ies</w:t>
+            </w:r>
+            <w:r>
+              <w:rPr>
+                <w:rFonts w:ascii="Calibri" w:hAnsi="Calibri" w:cs="Calibri"/>
+              </w:rPr>
+              <w:t xml:space="preserve"> and </w:t>
             </w:r>
             <w:r>
               <w:rPr>
@@ -2957,20 +3216,26 @@
               <w:rPr>
                 <w:rFonts w:ascii="Calibri" w:hAnsi="Calibri" w:cs="Calibri"/>
               </w:rPr>
-              <w:t xml:space="preserve"> SDLC (Software Development Life Cycle) </w:t>
-            </w:r>
-          </w:p>
-          <w:p>
-            <w:pPr>
-              <w:rPr>
-                <w:rFonts w:ascii="Calibri" w:hAnsi="Calibri" w:cs="Calibri"/>
-              </w:rPr>
-            </w:pPr>
-            <w:r>
-              <w:rPr>
-                <w:rFonts w:ascii="Calibri" w:hAnsi="Calibri" w:cs="Calibri"/>
-              </w:rPr>
-              <w:t xml:space="preserve">A method/ approach where we need to go back to the previous phase to review/ retest. </w:t>
+              <w:t xml:space="preserve"> SDLC (Software Development Life Cycle)</w:t>
+            </w:r>
+            <w:r>
+              <w:rPr>
+                <w:rFonts w:ascii="Calibri" w:hAnsi="Calibri" w:cs="Calibri"/>
+              </w:rPr>
+              <w:t>.</w:t>
+            </w:r>
+          </w:p>
+          <w:p>
+            <w:pPr>
+              <w:rPr>
+                <w:rFonts w:ascii="Calibri" w:hAnsi="Calibri" w:cs="Calibri"/>
+              </w:rPr>
+            </w:pPr>
+            <w:r>
+              <w:rPr>
+                <w:rFonts w:ascii="Calibri" w:hAnsi="Calibri" w:cs="Calibri"/>
+              </w:rPr>
+              <w:t xml:space="preserve">A method/approach where we need to go back to the previous phase to review/retest. </w:t>
             </w:r>
           </w:p>
           <w:p>
@@ -2996,15 +3261,56 @@
               <w:rPr>
                 <w:rFonts w:ascii="Calibri" w:hAnsi="Calibri" w:cs="Calibri"/>
               </w:rPr>
-              <w:t xml:space="preserve">Note: Our Project does not require Business case. </w:t>
-            </w:r>
-          </w:p>
-          <w:p>
-            <w:pPr>
-              <w:rPr>
-                <w:rFonts w:ascii="Calibri" w:hAnsi="Calibri" w:cs="Calibri"/>
-              </w:rPr>
-            </w:pPr>
+              <w:t xml:space="preserve">Note: Our </w:t>
+            </w:r>
+            <w:r>
+              <w:rPr>
+                <w:rFonts w:ascii="Calibri" w:hAnsi="Calibri" w:cs="Calibri"/>
+              </w:rPr>
+              <w:t>p</w:t>
+            </w:r>
+            <w:r>
+              <w:rPr>
+                <w:rFonts w:ascii="Calibri" w:hAnsi="Calibri" w:cs="Calibri"/>
+              </w:rPr>
+              <w:t>roject does not require</w:t>
+            </w:r>
+            <w:r>
+              <w:rPr>
+                <w:rFonts w:ascii="Calibri" w:hAnsi="Calibri" w:cs="Calibri"/>
+              </w:rPr>
+              <w:t xml:space="preserve"> a</w:t>
+            </w:r>
+            <w:r>
+              <w:rPr>
+                <w:rFonts w:ascii="Calibri" w:hAnsi="Calibri" w:cs="Calibri"/>
+              </w:rPr>
+              <w:t xml:space="preserve"> </w:t>
+            </w:r>
+            <w:r>
+              <w:rPr>
+                <w:rFonts w:ascii="Calibri" w:hAnsi="Calibri" w:cs="Calibri"/>
+              </w:rPr>
+              <w:t>B</w:t>
+            </w:r>
+            <w:r>
+              <w:rPr>
+                <w:rFonts w:ascii="Calibri" w:hAnsi="Calibri" w:cs="Calibri"/>
+              </w:rPr>
+              <w:t xml:space="preserve">usiness </w:t>
+            </w:r>
+            <w:r>
+              <w:rPr>
+                <w:rFonts w:ascii="Calibri" w:hAnsi="Calibri" w:cs="Calibri"/>
+              </w:rPr>
+              <w:t>C</w:t>
+            </w:r>
+            <w:r>
+              <w:rPr>
+                <w:rFonts w:ascii="Calibri" w:hAnsi="Calibri" w:cs="Calibri"/>
+              </w:rPr>
+              <w:t xml:space="preserve">ase. </w:t>
+            </w:r>
           </w:p>
         </w:tc>
       </w:tr>
@@ -3047,12 +3353,6 @@
               </w:rPr>
               <w:t>Team meeting schedules</w:t>
             </w:r>
-            <w:r>
-              <w:rPr>
-                <w:rFonts w:ascii="Calibri" w:hAnsi="Calibri" w:cs="Calibri"/>
-              </w:rPr>
-              <w:t xml:space="preserve">: </w:t>
-            </w:r>
           </w:p>
           <w:p>
             <w:pPr>
@@ -3101,7 +3401,19 @@
                 <w:rFonts w:ascii="Calibri" w:hAnsi="Calibri" w:cs="Calibri"/>
               </w:rPr>
               <w:br/>
-              <w:t xml:space="preserve">After the Submission of Project Proposal, we will have </w:t>
+              <w:t xml:space="preserve">After the </w:t>
+            </w:r>
+            <w:r>
+              <w:rPr>
+                <w:rFonts w:ascii="Calibri" w:hAnsi="Calibri" w:cs="Calibri"/>
+              </w:rPr>
+              <w:t>s</w:t>
+            </w:r>
+            <w:r>
+              <w:rPr>
+                <w:rFonts w:ascii="Calibri" w:hAnsi="Calibri" w:cs="Calibri"/>
+              </w:rPr>
+              <w:t xml:space="preserve">ubmission of Project Proposal, we will have </w:t>
             </w:r>
             <w:r>
               <w:rPr>
@@ -3113,7 +3425,7 @@
               <w:rPr>
                 <w:rFonts w:ascii="Calibri" w:hAnsi="Calibri" w:cs="Calibri"/>
               </w:rPr>
-              <w:t xml:space="preserve"> with the mentor/ client every fortnight. </w:t>
+              <w:t xml:space="preserve"> with the mentor/client every fortnight. </w:t>
             </w:r>
           </w:p>
         </w:tc>
@@ -3167,20 +3479,62 @@
               <w:rPr>
                 <w:rFonts w:ascii="Calibri" w:hAnsi="Calibri" w:cs="Calibri"/>
               </w:rPr>
-              <w:t>For estimate of project cost, we would need to account for all the costs on equipment, labors, and any expense incurred related to the project. They must be realistic too</w:t>
-            </w:r>
-          </w:p>
-          <w:p>
-            <w:pPr>
-              <w:rPr>
-                <w:rFonts w:ascii="Calibri" w:hAnsi="Calibri" w:cs="Calibri"/>
-              </w:rPr>
-            </w:pPr>
-            <w:r>
-              <w:rPr>
-                <w:rFonts w:ascii="Calibri" w:hAnsi="Calibri" w:cs="Calibri"/>
-              </w:rPr>
-              <w:t xml:space="preserve">We need to have references on the costs with reliable sources. </w:t>
+              <w:t>For estimate of project cost, we need to account for all the costs o</w:t>
+            </w:r>
+            <w:r>
+              <w:rPr>
+                <w:rFonts w:ascii="Calibri" w:hAnsi="Calibri" w:cs="Calibri"/>
+              </w:rPr>
+              <w:t>f</w:t>
+            </w:r>
+            <w:r>
+              <w:rPr>
+                <w:rFonts w:ascii="Calibri" w:hAnsi="Calibri" w:cs="Calibri"/>
+              </w:rPr>
+              <w:t xml:space="preserve"> equipment, labo</w:t>
+            </w:r>
+            <w:r>
+              <w:rPr>
+                <w:rFonts w:ascii="Calibri" w:hAnsi="Calibri" w:cs="Calibri"/>
+              </w:rPr>
+              <w:t>ur</w:t>
+            </w:r>
+            <w:r>
+              <w:rPr>
+                <w:rFonts w:ascii="Calibri" w:hAnsi="Calibri" w:cs="Calibri"/>
+              </w:rPr>
+              <w:t>, and any expense incurred related to the project. They must be realistic</w:t>
+            </w:r>
+            <w:r>
+              <w:rPr>
+                <w:rFonts w:ascii="Calibri" w:hAnsi="Calibri" w:cs="Calibri"/>
+              </w:rPr>
+              <w:t>.</w:t>
+            </w:r>
+          </w:p>
+          <w:p>
+            <w:pPr>
+              <w:rPr>
+                <w:rFonts w:ascii="Calibri" w:hAnsi="Calibri" w:cs="Calibri"/>
+              </w:rPr>
+            </w:pPr>
+            <w:r>
+              <w:rPr>
+                <w:rFonts w:ascii="Calibri" w:hAnsi="Calibri" w:cs="Calibri"/>
+              </w:rPr>
+              <w:t xml:space="preserve">We need to have references </w:t>
+            </w:r>
+            <w:r>
+              <w:rPr>
+                <w:rFonts w:ascii="Calibri" w:hAnsi="Calibri" w:cs="Calibri"/>
+              </w:rPr>
+              <w:t>for</w:t>
+            </w:r>
+            <w:r>
+              <w:rPr>
+                <w:rFonts w:ascii="Calibri" w:hAnsi="Calibri" w:cs="Calibri"/>
+              </w:rPr>
+              <w:t xml:space="preserve"> the costs with reliable sources. </w:t>
             </w:r>
           </w:p>
         </w:tc>
@@ -3218,13 +3572,61 @@
               <w:rPr>
                 <w:rFonts w:ascii="Calibri" w:hAnsi="Calibri" w:cs="Calibri"/>
               </w:rPr>
-              <w:t xml:space="preserve">We were told to add Mentor and Client into Teams Group. The mentor will add the AUT IT tech guy, for us to communicate and find out more information on the specification of the hardware, and </w:t>
-            </w:r>
-            <w:r>
-              <w:rPr>
-                <w:rFonts w:ascii="Calibri" w:hAnsi="Calibri" w:cs="Calibri"/>
-              </w:rPr>
-              <w:t>when we could use the equipment for testing</w:t>
+              <w:t xml:space="preserve">We were told to add Mentor and Client into Teams </w:t>
+            </w:r>
+            <w:r>
+              <w:rPr>
+                <w:rFonts w:ascii="Calibri" w:hAnsi="Calibri" w:cs="Calibri"/>
+              </w:rPr>
+              <w:t>g</w:t>
+            </w:r>
+            <w:r>
+              <w:rPr>
+                <w:rFonts w:ascii="Calibri" w:hAnsi="Calibri" w:cs="Calibri"/>
+              </w:rPr>
+              <w:t>roup. The mentor will add the AUT IT tec</w:t>
+            </w:r>
+            <w:r>
+              <w:rPr>
+                <w:rFonts w:ascii="Calibri" w:hAnsi="Calibri" w:cs="Calibri"/>
+              </w:rPr>
+              <w:t>hnician</w:t>
+            </w:r>
+            <w:r>
+              <w:rPr>
+                <w:rFonts w:ascii="Calibri" w:hAnsi="Calibri" w:cs="Calibri"/>
+              </w:rPr>
+              <w:t xml:space="preserve"> for us to communicate and find out more information on the specification</w:t>
+            </w:r>
+            <w:r>
+              <w:rPr>
+                <w:rFonts w:ascii="Calibri" w:hAnsi="Calibri" w:cs="Calibri"/>
+              </w:rPr>
+              <w:t>s</w:t>
+            </w:r>
+            <w:r>
+              <w:rPr>
+                <w:rFonts w:ascii="Calibri" w:hAnsi="Calibri" w:cs="Calibri"/>
+              </w:rPr>
+              <w:t xml:space="preserve"> of the hardware, and </w:t>
+            </w:r>
+            <w:r>
+              <w:rPr>
+                <w:rFonts w:ascii="Calibri" w:hAnsi="Calibri" w:cs="Calibri"/>
+              </w:rPr>
+              <w:t>when we c</w:t>
+            </w:r>
+            <w:r>
+              <w:rPr>
+                <w:rFonts w:ascii="Calibri" w:hAnsi="Calibri" w:cs="Calibri"/>
+              </w:rPr>
+              <w:t>an</w:t>
+            </w:r>
+            <w:r>
+              <w:rPr>
+                <w:rFonts w:ascii="Calibri" w:hAnsi="Calibri" w:cs="Calibri"/>
+              </w:rPr>
+              <w:t xml:space="preserve"> use the equipment for testing</w:t>
             </w:r>
             <w:r>
               <w:rPr>
@@ -3268,7 +3670,31 @@
               <w:rPr>
                 <w:rFonts w:ascii="Calibri" w:hAnsi="Calibri" w:cs="Calibri"/>
               </w:rPr>
-              <w:t>Reminder of the project proposal due date on 4</w:t>
+              <w:t xml:space="preserve">Reminder of the </w:t>
+            </w:r>
+            <w:r>
+              <w:rPr>
+                <w:rFonts w:ascii="Calibri" w:hAnsi="Calibri" w:cs="Calibri"/>
+              </w:rPr>
+              <w:t>P</w:t>
+            </w:r>
+            <w:r>
+              <w:rPr>
+                <w:rFonts w:ascii="Calibri" w:hAnsi="Calibri" w:cs="Calibri"/>
+              </w:rPr>
+              <w:t xml:space="preserve">roject </w:t>
+            </w:r>
+            <w:r>
+              <w:rPr>
+                <w:rFonts w:ascii="Calibri" w:hAnsi="Calibri" w:cs="Calibri"/>
+              </w:rPr>
+              <w:t>P</w:t>
+            </w:r>
+            <w:r>
+              <w:rPr>
+                <w:rFonts w:ascii="Calibri" w:hAnsi="Calibri" w:cs="Calibri"/>
+              </w:rPr>
+              <w:t>roposal due date on 4</w:t>
             </w:r>
             <w:r>
               <w:rPr>
@@ -3281,7 +3707,31 @@
               <w:rPr>
                 <w:rFonts w:ascii="Calibri" w:hAnsi="Calibri" w:cs="Calibri"/>
               </w:rPr>
-              <w:t xml:space="preserve"> of April 23:59. </w:t>
+              <w:t xml:space="preserve"> of April </w:t>
+            </w:r>
+            <w:r>
+              <w:rPr>
+                <w:rFonts w:ascii="Calibri" w:hAnsi="Calibri" w:cs="Calibri"/>
+              </w:rPr>
+              <w:t>11</w:t>
+            </w:r>
+            <w:r>
+              <w:rPr>
+                <w:rFonts w:ascii="Calibri" w:hAnsi="Calibri" w:cs="Calibri"/>
+              </w:rPr>
+              <w:t>:59</w:t>
+            </w:r>
+            <w:r>
+              <w:rPr>
+                <w:rFonts w:ascii="Calibri" w:hAnsi="Calibri" w:cs="Calibri"/>
+              </w:rPr>
+              <w:t>pm</w:t>
+            </w:r>
+            <w:r>
+              <w:rPr>
+                <w:rFonts w:ascii="Calibri" w:hAnsi="Calibri" w:cs="Calibri"/>
+              </w:rPr>
+              <w:t xml:space="preserve">. </w:t>
             </w:r>
           </w:p>
           <w:p>
@@ -3301,15 +3751,20 @@
                 <w:rFonts w:ascii="Calibri" w:hAnsi="Calibri" w:cs="Calibri"/>
               </w:rPr>
               <w:br/>
-              <w:t xml:space="preserve">The project Proposal should only be 10 pages, and any other documents should be attached in the Appendix. </w:t>
-            </w:r>
-          </w:p>
-          <w:p>
-            <w:pPr>
-              <w:rPr>
-                <w:rFonts w:ascii="Calibri" w:hAnsi="Calibri" w:cs="Calibri"/>
-              </w:rPr>
-            </w:pPr>
+              <w:t xml:space="preserve">The </w:t>
+            </w:r>
+            <w:r>
+              <w:rPr>
+                <w:rFonts w:ascii="Calibri" w:hAnsi="Calibri" w:cs="Calibri"/>
+              </w:rPr>
+              <w:t>P</w:t>
+            </w:r>
+            <w:r>
+              <w:rPr>
+                <w:rFonts w:ascii="Calibri" w:hAnsi="Calibri" w:cs="Calibri"/>
+              </w:rPr>
+              <w:t xml:space="preserve">roject Proposal should only be 10 pages, and any other documents should be attached in the Appendix. </w:t>
+            </w:r>
           </w:p>
         </w:tc>
       </w:tr>
@@ -3446,15 +3901,7 @@
                 <w:rFonts w:ascii="Calibri" w:hAnsi="Calibri" w:cs="Calibri"/>
                 <w:b/>
               </w:rPr>
-              <w:t xml:space="preserve">Expected Completion </w:t>
-            </w:r>
-            <w:r>
-              <w:rPr>
-                <w:rFonts w:ascii="Calibri" w:hAnsi="Calibri" w:cs="Calibri"/>
-                <w:b/>
-              </w:rPr>
-              <w:lastRenderedPageBreak/>
-              <w:t>Date</w:t>
+              <w:t>Expected Completion Date</w:t>
             </w:r>
           </w:p>
         </w:tc>
@@ -3569,7 +4016,7 @@
           <w:rFonts w:ascii="Calibri" w:hAnsi="Calibri" w:cs="Calibri"/>
           <w:b/>
         </w:rPr>
-        <w:t>Client/ Mentor Meeting</w:t>
+        <w:t>Meeting</w:t>
       </w:r>
       <w:r>
         <w:rPr>
@@ -3637,24 +4084,10 @@
             <w:r>
               <w:rPr>
                 <w:rFonts w:ascii="Calibri" w:hAnsi="Calibri" w:cs="Calibri"/>
-                <w:b/>
+                <w:bCs/>
               </w:rPr>
               <w:t>27/03/2025</w:t>
             </w:r>
-            <w:r>
-              <w:rPr>
-                <w:rFonts w:ascii="Calibri" w:hAnsi="Calibri" w:cs="Calibri"/>
-                <w:b/>
-              </w:rPr>
-              <w:t xml:space="preserve"> Thursday</w:t>
-            </w:r>
-          </w:p>
-          <w:p>
-            <w:pPr>
-              <w:rPr>
-                <w:rFonts w:ascii="Calibri" w:hAnsi="Calibri" w:cs="Calibri"/>
-              </w:rPr>
-            </w:pPr>
           </w:p>
         </w:tc>
         <w:tc>
@@ -3680,15 +4113,22 @@
                 <w:rFonts w:ascii="Calibri" w:hAnsi="Calibri" w:cs="Calibri"/>
                 <w:b/>
               </w:rPr>
-              <w:t xml:space="preserve"> 10:00 AM</w:t>
-            </w:r>
-          </w:p>
-          <w:p>
-            <w:pPr>
-              <w:rPr>
-                <w:rFonts w:ascii="Calibri" w:hAnsi="Calibri" w:cs="Calibri"/>
-              </w:rPr>
-            </w:pPr>
+              <w:t xml:space="preserve"> </w:t>
+            </w:r>
+            <w:r>
+              <w:rPr>
+                <w:rFonts w:ascii="Calibri" w:hAnsi="Calibri" w:cs="Calibri"/>
+                <w:bCs/>
+              </w:rPr>
+              <w:t>10:00</w:t>
+            </w:r>
+            <w:r>
+              <w:rPr>
+                <w:rFonts w:ascii="Calibri" w:hAnsi="Calibri" w:cs="Calibri"/>
+                <w:bCs/>
+              </w:rPr>
+              <w:t>am</w:t>
+            </w:r>
           </w:p>
         </w:tc>
       </w:tr>
@@ -3794,7 +4234,19 @@
               <w:rPr>
                 <w:rFonts w:ascii="Calibri" w:hAnsi="Calibri" w:cs="Calibri"/>
               </w:rPr>
-              <w:t xml:space="preserve">Project Proposal Update </w:t>
+              <w:t xml:space="preserve">Project Proposal </w:t>
+            </w:r>
+            <w:r>
+              <w:rPr>
+                <w:rFonts w:ascii="Calibri" w:hAnsi="Calibri" w:cs="Calibri"/>
+              </w:rPr>
+              <w:t>u</w:t>
+            </w:r>
+            <w:r>
+              <w:rPr>
+                <w:rFonts w:ascii="Calibri" w:hAnsi="Calibri" w:cs="Calibri"/>
+              </w:rPr>
+              <w:t xml:space="preserve">pdate </w:t>
             </w:r>
           </w:p>
         </w:tc>
@@ -3848,75 +4300,9 @@
           </w:p>
         </w:tc>
       </w:tr>
-      <w:tr>
-        <w:tc>
-          <w:tcPr>
-            <w:tcW w:w="9990" w:type="dxa"/>
-            <w:gridSpan w:val="3"/>
-            <w:vAlign w:val="center"/>
-          </w:tcPr>
-          <w:p>
-            <w:pPr>
-              <w:rPr>
-                <w:rFonts w:ascii="Calibri" w:hAnsi="Calibri" w:cs="Calibri"/>
-                <w:i/>
-              </w:rPr>
-            </w:pPr>
-            <w:r>
-              <w:rPr>
-                <w:rFonts w:ascii="Calibri" w:hAnsi="Calibri" w:cs="Calibri"/>
-                <w:i/>
-              </w:rPr>
-              <w:t>Action Items to be discussed in the next meeting:</w:t>
-            </w:r>
-          </w:p>
-        </w:tc>
-      </w:tr>
-      <w:tr>
-        <w:tc>
-          <w:tcPr>
-            <w:tcW w:w="540" w:type="dxa"/>
-            <w:vAlign w:val="center"/>
-          </w:tcPr>
-          <w:p>
-            <w:pPr>
-              <w:numPr>
-                <w:ilvl w:val="0"/>
-                <w:numId w:val="17"/>
-              </w:numPr>
-              <w:ind w:left="245" w:hanging="202"/>
-              <w:rPr>
-                <w:rFonts w:ascii="Calibri" w:hAnsi="Calibri" w:cs="Calibri"/>
-              </w:rPr>
-            </w:pPr>
-          </w:p>
-        </w:tc>
-        <w:tc>
-          <w:tcPr>
-            <w:tcW w:w="9450" w:type="dxa"/>
-            <w:gridSpan w:val="2"/>
-            <w:vAlign w:val="center"/>
-          </w:tcPr>
-          <w:p>
-            <w:pPr>
-              <w:rPr>
-                <w:rFonts w:ascii="Calibri" w:hAnsi="Calibri" w:cs="Calibri"/>
-              </w:rPr>
-            </w:pPr>
-          </w:p>
-        </w:tc>
-      </w:tr>
     </w:tbl>
     <w:p>
       <w:pPr>
-        <w:rPr>
-          <w:rFonts w:ascii="Calibri" w:hAnsi="Calibri" w:cs="Calibri"/>
-        </w:rPr>
-      </w:pPr>
-    </w:p>
-    <w:p>
-      <w:pPr>
-        <w:jc w:val="center"/>
         <w:rPr>
           <w:rFonts w:ascii="Calibri" w:hAnsi="Calibri" w:cs="Calibri"/>
           <w:b/>
@@ -4024,7 +4410,6 @@
       <w:rPr>
         <w:rStyle w:val="PageNumber"/>
         <w:rFonts w:ascii="Arial" w:hAnsi="Arial" w:cs="Arial"/>
-        <w:noProof/>
         <w:sz w:val="18"/>
         <w:szCs w:val="18"/>
       </w:rPr>
@@ -4079,7 +4464,6 @@
       <w:rPr>
         <w:rStyle w:val="PageNumber"/>
         <w:rFonts w:ascii="Arial" w:hAnsi="Arial" w:cs="Arial"/>
-        <w:noProof/>
         <w:sz w:val="18"/>
         <w:szCs w:val="18"/>
       </w:rPr>
@@ -4137,7 +4521,6 @@
       <w:rPr>
         <w:rFonts w:ascii="Arial" w:hAnsi="Arial" w:cs="Arial"/>
         <w:b/>
-        <w:noProof/>
         <w:sz w:val="32"/>
         <w:szCs w:val="32"/>
       </w:rPr>
@@ -4228,6 +4611,119 @@
 <file path=word/numbering.xml><?xml version="1.0" encoding="utf-8"?>
 <w:numbering xmlns:wpc="http://schemas.microsoft.com/office/word/2010/wordprocessingCanvas" xmlns:cx="http://schemas.microsoft.com/office/drawing/2014/chartex" xmlns:cx1="http://schemas.microsoft.com/office/drawing/2015/9/8/chartex" xmlns:cx2="http://schemas.microsoft.com/office/drawing/2015/10/21/chartex" xmlns:cx3="http://schemas.microsoft.com/office/drawing/2016/5/9/chartex" xmlns:cx4="http://schemas.microsoft.com/office/drawing/2016/5/10/chartex" xmlns:cx5="http://schemas.microsoft.com/office/drawing/2016/5/11/chartex" xmlns:cx6="http://schemas.microsoft.com/office/drawing/2016/5/12/chartex" xmlns:cx7="http://schemas.microsoft.com/office/drawing/2016/5/13/chartex" xmlns:cx8="http://schemas.microsoft.com/office/drawing/2016/5/14/chartex" xmlns:mc="http://schemas.openxmlformats.org/markup-compatibility/2006" xmlns:aink="http://schemas.microsoft.com/office/drawing/2016/ink" xmlns:am3d="http://schemas.microsoft.com/office/drawing/2017/model3d" xmlns:o="urn:schemas-microsoft-com:office:office" xmlns:oel="http://schemas.microsoft.com/office/2019/extlst" xmlns:r="http://schemas.openxmlformats.org/officeDocument/2006/relationships" xmlns:m="http://schemas.openxmlformats.org/officeDocument/2006/math" xmlns:v="urn:schemas-microsoft-com:vml" xmlns:wp14="http://schemas.microsoft.com/office/word/2010/wordprocessingDrawing" xmlns:wp="http://schemas.openxmlformats.org/drawingml/2006/wordprocessingDrawing" xmlns:w10="urn:schemas-microsoft-com:office:word" xmlns:w="http://schemas.openxmlformats.org/wordprocessingml/2006/main" xmlns:w14="http://schemas.microsoft.com/office/word/2010/wordml" xmlns:w15="http://schemas.microsoft.com/office/word/2012/wordml" xmlns:w16cex="http://schemas.microsoft.com/office/word/2018/wordml/cex" xmlns:w16cid="http://schemas.microsoft.com/office/word/2016/wordml/cid" xmlns:w16="http://schemas.microsoft.com/office/word/2018/wordml" xmlns:w16du="http://schemas.microsoft.com/office/word/2023/wordml/word16du" xmlns:w16sdtdh="http://schemas.microsoft.com/office/word/2020/wordml/sdtdatahash" xmlns:w16sdtfl="http://schemas.microsoft.com/office/word/2024/wordml/sdtformatlock" xmlns:w16se="http://schemas.microsoft.com/office/word/2015/wordml/symex" xmlns:wpg="http://schemas.microsoft.com/office/word/2010/wordprocessingGroup" xmlns:wpi="http://schemas.microsoft.com/office/word/2010/wordprocessingInk" xmlns:wne="http://schemas.microsoft.com/office/word/2006/wordml" xmlns:wps="http://schemas.microsoft.com/office/word/2010/wordprocessingShape" mc:Ignorable="w14 w15 w16se w16cid w16 w16cex w16sdtdh w16sdtfl w16du wp14">
   <w:abstractNum w:abstractNumId="0" w15:restartNumberingAfterBreak="0">
+    <w:nsid w:val="000E5484"/>
+    <w:multiLevelType w:val="hybridMultilevel"/>
+    <w:tmpl w:val="16B46CF6"/>
+    <w:lvl w:ilvl="0" w:tplc="14090001">
+      <w:start w:val="1"/>
+      <w:numFmt w:val="bullet"/>
+      <w:lvlText w:val=""/>
+      <w:lvlJc w:val="left"/>
+      <w:pPr>
+        <w:ind w:left="360" w:hanging="360"/>
+      </w:pPr>
+      <w:rPr>
+        <w:rFonts w:ascii="Symbol" w:hAnsi="Symbol" w:hint="default"/>
+      </w:rPr>
+    </w:lvl>
+    <w:lvl w:ilvl="1" w:tplc="14090003" w:tentative="1">
+      <w:start w:val="1"/>
+      <w:numFmt w:val="bullet"/>
+      <w:lvlText w:val="o"/>
+      <w:lvlJc w:val="left"/>
+      <w:pPr>
+        <w:ind w:left="1080" w:hanging="360"/>
+      </w:pPr>
+      <w:rPr>
+        <w:rFonts w:ascii="Courier New" w:hAnsi="Courier New" w:cs="Courier New" w:hint="default"/>
+      </w:rPr>
+    </w:lvl>
+    <w:lvl w:ilvl="2" w:tplc="14090005" w:tentative="1">
+      <w:start w:val="1"/>
+      <w:numFmt w:val="bullet"/>
+      <w:lvlText w:val=""/>
+      <w:lvlJc w:val="left"/>
+      <w:pPr>
+        <w:ind w:left="1800" w:hanging="360"/>
+      </w:pPr>
+      <w:rPr>
+        <w:rFonts w:ascii="Wingdings" w:hAnsi="Wingdings" w:hint="default"/>
+      </w:rPr>
+    </w:lvl>
+    <w:lvl w:ilvl="3" w:tplc="14090001" w:tentative="1">
+      <w:start w:val="1"/>
+      <w:numFmt w:val="bullet"/>
+      <w:lvlText w:val=""/>
+      <w:lvlJc w:val="left"/>
+      <w:pPr>
+        <w:ind w:left="2520" w:hanging="360"/>
+      </w:pPr>
+      <w:rPr>
+        <w:rFonts w:ascii="Symbol" w:hAnsi="Symbol" w:hint="default"/>
+      </w:rPr>
+    </w:lvl>
+    <w:lvl w:ilvl="4" w:tplc="14090003" w:tentative="1">
+      <w:start w:val="1"/>
+      <w:numFmt w:val="bullet"/>
+      <w:lvlText w:val="o"/>
+      <w:lvlJc w:val="left"/>
+      <w:pPr>
+        <w:ind w:left="3240" w:hanging="360"/>
+      </w:pPr>
+      <w:rPr>
+        <w:rFonts w:ascii="Courier New" w:hAnsi="Courier New" w:cs="Courier New" w:hint="default"/>
+      </w:rPr>
+    </w:lvl>
+    <w:lvl w:ilvl="5" w:tplc="14090005" w:tentative="1">
+      <w:start w:val="1"/>
+      <w:numFmt w:val="bullet"/>
+      <w:lvlText w:val=""/>
+      <w:lvlJc w:val="left"/>
+      <w:pPr>
+        <w:ind w:left="3960" w:hanging="360"/>
+      </w:pPr>
+      <w:rPr>
+        <w:rFonts w:ascii="Wingdings" w:hAnsi="Wingdings" w:hint="default"/>
+      </w:rPr>
+    </w:lvl>
+    <w:lvl w:ilvl="6" w:tplc="14090001" w:tentative="1">
+      <w:start w:val="1"/>
+      <w:numFmt w:val="bullet"/>
+      <w:lvlText w:val=""/>
+      <w:lvlJc w:val="left"/>
+      <w:pPr>
+        <w:ind w:left="4680" w:hanging="360"/>
+      </w:pPr>
+      <w:rPr>
+        <w:rFonts w:ascii="Symbol" w:hAnsi="Symbol" w:hint="default"/>
+      </w:rPr>
+    </w:lvl>
+    <w:lvl w:ilvl="7" w:tplc="14090003" w:tentative="1">
+      <w:start w:val="1"/>
+      <w:numFmt w:val="bullet"/>
+      <w:lvlText w:val="o"/>
+      <w:lvlJc w:val="left"/>
+      <w:pPr>
+        <w:ind w:left="5400" w:hanging="360"/>
+      </w:pPr>
+      <w:rPr>
+        <w:rFonts w:ascii="Courier New" w:hAnsi="Courier New" w:cs="Courier New" w:hint="default"/>
+      </w:rPr>
+    </w:lvl>
+    <w:lvl w:ilvl="8" w:tplc="14090005" w:tentative="1">
+      <w:start w:val="1"/>
+      <w:numFmt w:val="bullet"/>
+      <w:lvlText w:val=""/>
+      <w:lvlJc w:val="left"/>
+      <w:pPr>
+        <w:ind w:left="6120" w:hanging="360"/>
+      </w:pPr>
+      <w:rPr>
+        <w:rFonts w:ascii="Wingdings" w:hAnsi="Wingdings" w:hint="default"/>
+      </w:rPr>
+    </w:lvl>
+  </w:abstractNum>
+  <w:abstractNum w:abstractNumId="1" w15:restartNumberingAfterBreak="0">
     <w:nsid w:val="03370C2D"/>
     <w:multiLevelType w:val="hybridMultilevel"/>
     <w:tmpl w:val="9F5286C8"/>
@@ -4340,7 +4836,7 @@
       </w:pPr>
     </w:lvl>
   </w:abstractNum>
-  <w:abstractNum w:abstractNumId="1" w15:restartNumberingAfterBreak="0">
+  <w:abstractNum w:abstractNumId="2" w15:restartNumberingAfterBreak="0">
     <w:nsid w:val="03B274FF"/>
     <w:multiLevelType w:val="hybridMultilevel"/>
     <w:tmpl w:val="BECE77BE"/>
@@ -4426,7 +4922,7 @@
       </w:pPr>
     </w:lvl>
   </w:abstractNum>
-  <w:abstractNum w:abstractNumId="2" w15:restartNumberingAfterBreak="0">
+  <w:abstractNum w:abstractNumId="3" w15:restartNumberingAfterBreak="0">
     <w:nsid w:val="10426DD0"/>
     <w:multiLevelType w:val="hybridMultilevel"/>
     <w:tmpl w:val="94EA5074"/>
@@ -4512,7 +5008,7 @@
       </w:pPr>
     </w:lvl>
   </w:abstractNum>
-  <w:abstractNum w:abstractNumId="3" w15:restartNumberingAfterBreak="0">
+  <w:abstractNum w:abstractNumId="4" w15:restartNumberingAfterBreak="0">
     <w:nsid w:val="16184322"/>
     <w:multiLevelType w:val="hybridMultilevel"/>
     <w:tmpl w:val="8570A53A"/>
@@ -4601,7 +5097,7 @@
       </w:pPr>
     </w:lvl>
   </w:abstractNum>
-  <w:abstractNum w:abstractNumId="4" w15:restartNumberingAfterBreak="0">
+  <w:abstractNum w:abstractNumId="5" w15:restartNumberingAfterBreak="0">
     <w:nsid w:val="16527F17"/>
     <w:multiLevelType w:val="hybridMultilevel"/>
     <w:tmpl w:val="94EA5074"/>
@@ -4687,7 +5183,7 @@
       </w:pPr>
     </w:lvl>
   </w:abstractNum>
-  <w:abstractNum w:abstractNumId="5" w15:restartNumberingAfterBreak="0">
+  <w:abstractNum w:abstractNumId="6" w15:restartNumberingAfterBreak="0">
     <w:nsid w:val="16FE30E8"/>
     <w:multiLevelType w:val="hybridMultilevel"/>
     <w:tmpl w:val="8570A53A"/>
@@ -4776,7 +5272,7 @@
       </w:pPr>
     </w:lvl>
   </w:abstractNum>
-  <w:abstractNum w:abstractNumId="6" w15:restartNumberingAfterBreak="0">
+  <w:abstractNum w:abstractNumId="7" w15:restartNumberingAfterBreak="0">
     <w:nsid w:val="1B0C5832"/>
     <w:multiLevelType w:val="hybridMultilevel"/>
     <w:tmpl w:val="94EA5074"/>
@@ -4862,7 +5358,7 @@
       </w:pPr>
     </w:lvl>
   </w:abstractNum>
-  <w:abstractNum w:abstractNumId="7" w15:restartNumberingAfterBreak="0">
+  <w:abstractNum w:abstractNumId="8" w15:restartNumberingAfterBreak="0">
     <w:nsid w:val="1C701DBD"/>
     <w:multiLevelType w:val="hybridMultilevel"/>
     <w:tmpl w:val="8570A53A"/>
@@ -4951,7 +5447,7 @@
       </w:pPr>
     </w:lvl>
   </w:abstractNum>
-  <w:abstractNum w:abstractNumId="8" w15:restartNumberingAfterBreak="0">
+  <w:abstractNum w:abstractNumId="9" w15:restartNumberingAfterBreak="0">
     <w:nsid w:val="212823D0"/>
     <w:multiLevelType w:val="hybridMultilevel"/>
     <w:tmpl w:val="94EA5074"/>
@@ -5037,7 +5533,7 @@
       </w:pPr>
     </w:lvl>
   </w:abstractNum>
-  <w:abstractNum w:abstractNumId="9" w15:restartNumberingAfterBreak="0">
+  <w:abstractNum w:abstractNumId="10" w15:restartNumberingAfterBreak="0">
     <w:nsid w:val="22665830"/>
     <w:multiLevelType w:val="hybridMultilevel"/>
     <w:tmpl w:val="8570A53A"/>
@@ -5126,7 +5622,7 @@
       </w:pPr>
     </w:lvl>
   </w:abstractNum>
-  <w:abstractNum w:abstractNumId="10" w15:restartNumberingAfterBreak="0">
+  <w:abstractNum w:abstractNumId="11" w15:restartNumberingAfterBreak="0">
     <w:nsid w:val="22693C3E"/>
     <w:multiLevelType w:val="hybridMultilevel"/>
     <w:tmpl w:val="C0E49EAE"/>
@@ -5215,7 +5711,7 @@
       </w:pPr>
     </w:lvl>
   </w:abstractNum>
-  <w:abstractNum w:abstractNumId="11" w15:restartNumberingAfterBreak="0">
+  <w:abstractNum w:abstractNumId="12" w15:restartNumberingAfterBreak="0">
     <w:nsid w:val="31DA3354"/>
     <w:multiLevelType w:val="hybridMultilevel"/>
     <w:tmpl w:val="BECE77BE"/>
@@ -5301,7 +5797,7 @@
       </w:pPr>
     </w:lvl>
   </w:abstractNum>
-  <w:abstractNum w:abstractNumId="12" w15:restartNumberingAfterBreak="0">
+  <w:abstractNum w:abstractNumId="13" w15:restartNumberingAfterBreak="0">
     <w:nsid w:val="38597691"/>
     <w:multiLevelType w:val="hybridMultilevel"/>
     <w:tmpl w:val="E104D2C6"/>
@@ -5414,7 +5910,120 @@
       </w:pPr>
     </w:lvl>
   </w:abstractNum>
-  <w:abstractNum w:abstractNumId="13" w15:restartNumberingAfterBreak="0">
+  <w:abstractNum w:abstractNumId="14" w15:restartNumberingAfterBreak="0">
+    <w:nsid w:val="41952E16"/>
+    <w:multiLevelType w:val="hybridMultilevel"/>
+    <w:tmpl w:val="95FC7CEE"/>
+    <w:lvl w:ilvl="0" w:tplc="14090001">
+      <w:start w:val="1"/>
+      <w:numFmt w:val="bullet"/>
+      <w:lvlText w:val=""/>
+      <w:lvlJc w:val="left"/>
+      <w:pPr>
+        <w:ind w:left="360" w:hanging="360"/>
+      </w:pPr>
+      <w:rPr>
+        <w:rFonts w:ascii="Symbol" w:hAnsi="Symbol" w:hint="default"/>
+      </w:rPr>
+    </w:lvl>
+    <w:lvl w:ilvl="1" w:tplc="14090003" w:tentative="1">
+      <w:start w:val="1"/>
+      <w:numFmt w:val="bullet"/>
+      <w:lvlText w:val="o"/>
+      <w:lvlJc w:val="left"/>
+      <w:pPr>
+        <w:ind w:left="1080" w:hanging="360"/>
+      </w:pPr>
+      <w:rPr>
+        <w:rFonts w:ascii="Courier New" w:hAnsi="Courier New" w:cs="Courier New" w:hint="default"/>
+      </w:rPr>
+    </w:lvl>
+    <w:lvl w:ilvl="2" w:tplc="14090005" w:tentative="1">
+      <w:start w:val="1"/>
+      <w:numFmt w:val="bullet"/>
+      <w:lvlText w:val=""/>
+      <w:lvlJc w:val="left"/>
+      <w:pPr>
+        <w:ind w:left="1800" w:hanging="360"/>
+      </w:pPr>
+      <w:rPr>
+        <w:rFonts w:ascii="Wingdings" w:hAnsi="Wingdings" w:hint="default"/>
+      </w:rPr>
+    </w:lvl>
+    <w:lvl w:ilvl="3" w:tplc="14090001" w:tentative="1">
+      <w:start w:val="1"/>
+      <w:numFmt w:val="bullet"/>
+      <w:lvlText w:val=""/>
+      <w:lvlJc w:val="left"/>
+      <w:pPr>
+        <w:ind w:left="2520" w:hanging="360"/>
+      </w:pPr>
+      <w:rPr>
+        <w:rFonts w:ascii="Symbol" w:hAnsi="Symbol" w:hint="default"/>
+      </w:rPr>
+    </w:lvl>
+    <w:lvl w:ilvl="4" w:tplc="14090003" w:tentative="1">
+      <w:start w:val="1"/>
+      <w:numFmt w:val="bullet"/>
+      <w:lvlText w:val="o"/>
+      <w:lvlJc w:val="left"/>
+      <w:pPr>
+        <w:ind w:left="3240" w:hanging="360"/>
+      </w:pPr>
+      <w:rPr>
+        <w:rFonts w:ascii="Courier New" w:hAnsi="Courier New" w:cs="Courier New" w:hint="default"/>
+      </w:rPr>
+    </w:lvl>
+    <w:lvl w:ilvl="5" w:tplc="14090005" w:tentative="1">
+      <w:start w:val="1"/>
+      <w:numFmt w:val="bullet"/>
+      <w:lvlText w:val=""/>
+      <w:lvlJc w:val="left"/>
+      <w:pPr>
+        <w:ind w:left="3960" w:hanging="360"/>
+      </w:pPr>
+      <w:rPr>
+        <w:rFonts w:ascii="Wingdings" w:hAnsi="Wingdings" w:hint="default"/>
+      </w:rPr>
+    </w:lvl>
+    <w:lvl w:ilvl="6" w:tplc="14090001" w:tentative="1">
+      <w:start w:val="1"/>
+      <w:numFmt w:val="bullet"/>
+      <w:lvlText w:val=""/>
+      <w:lvlJc w:val="left"/>
+      <w:pPr>
+        <w:ind w:left="4680" w:hanging="360"/>
+      </w:pPr>
+      <w:rPr>
+        <w:rFonts w:ascii="Symbol" w:hAnsi="Symbol" w:hint="default"/>
+      </w:rPr>
+    </w:lvl>
+    <w:lvl w:ilvl="7" w:tplc="14090003" w:tentative="1">
+      <w:start w:val="1"/>
+      <w:numFmt w:val="bullet"/>
+      <w:lvlText w:val="o"/>
+      <w:lvlJc w:val="left"/>
+      <w:pPr>
+        <w:ind w:left="5400" w:hanging="360"/>
+      </w:pPr>
+      <w:rPr>
+        <w:rFonts w:ascii="Courier New" w:hAnsi="Courier New" w:cs="Courier New" w:hint="default"/>
+      </w:rPr>
+    </w:lvl>
+    <w:lvl w:ilvl="8" w:tplc="14090005" w:tentative="1">
+      <w:start w:val="1"/>
+      <w:numFmt w:val="bullet"/>
+      <w:lvlText w:val=""/>
+      <w:lvlJc w:val="left"/>
+      <w:pPr>
+        <w:ind w:left="6120" w:hanging="360"/>
+      </w:pPr>
+      <w:rPr>
+        <w:rFonts w:ascii="Wingdings" w:hAnsi="Wingdings" w:hint="default"/>
+      </w:rPr>
+    </w:lvl>
+  </w:abstractNum>
+  <w:abstractNum w:abstractNumId="15" w15:restartNumberingAfterBreak="0">
     <w:nsid w:val="49FA380A"/>
     <w:multiLevelType w:val="hybridMultilevel"/>
     <w:tmpl w:val="1676110C"/>
@@ -5503,7 +6112,7 @@
       </w:pPr>
     </w:lvl>
   </w:abstractNum>
-  <w:abstractNum w:abstractNumId="14" w15:restartNumberingAfterBreak="0">
+  <w:abstractNum w:abstractNumId="16" w15:restartNumberingAfterBreak="0">
     <w:nsid w:val="4D993B0C"/>
     <w:multiLevelType w:val="hybridMultilevel"/>
     <w:tmpl w:val="25D006B6"/>
@@ -5616,7 +6225,7 @@
       </w:rPr>
     </w:lvl>
   </w:abstractNum>
-  <w:abstractNum w:abstractNumId="15" w15:restartNumberingAfterBreak="0">
+  <w:abstractNum w:abstractNumId="17" w15:restartNumberingAfterBreak="0">
     <w:nsid w:val="4FAA006A"/>
     <w:multiLevelType w:val="hybridMultilevel"/>
     <w:tmpl w:val="94EA5074"/>
@@ -5702,7 +6311,120 @@
       </w:pPr>
     </w:lvl>
   </w:abstractNum>
-  <w:abstractNum w:abstractNumId="16" w15:restartNumberingAfterBreak="0">
+  <w:abstractNum w:abstractNumId="18" w15:restartNumberingAfterBreak="0">
+    <w:nsid w:val="54CE3A79"/>
+    <w:multiLevelType w:val="hybridMultilevel"/>
+    <w:tmpl w:val="C69E158E"/>
+    <w:lvl w:ilvl="0" w:tplc="14090001">
+      <w:start w:val="1"/>
+      <w:numFmt w:val="bullet"/>
+      <w:lvlText w:val=""/>
+      <w:lvlJc w:val="left"/>
+      <w:pPr>
+        <w:ind w:left="360" w:hanging="360"/>
+      </w:pPr>
+      <w:rPr>
+        <w:rFonts w:ascii="Symbol" w:hAnsi="Symbol" w:hint="default"/>
+      </w:rPr>
+    </w:lvl>
+    <w:lvl w:ilvl="1" w:tplc="14090003" w:tentative="1">
+      <w:start w:val="1"/>
+      <w:numFmt w:val="bullet"/>
+      <w:lvlText w:val="o"/>
+      <w:lvlJc w:val="left"/>
+      <w:pPr>
+        <w:ind w:left="1080" w:hanging="360"/>
+      </w:pPr>
+      <w:rPr>
+        <w:rFonts w:ascii="Courier New" w:hAnsi="Courier New" w:cs="Courier New" w:hint="default"/>
+      </w:rPr>
+    </w:lvl>
+    <w:lvl w:ilvl="2" w:tplc="14090005" w:tentative="1">
+      <w:start w:val="1"/>
+      <w:numFmt w:val="bullet"/>
+      <w:lvlText w:val=""/>
+      <w:lvlJc w:val="left"/>
+      <w:pPr>
+        <w:ind w:left="1800" w:hanging="360"/>
+      </w:pPr>
+      <w:rPr>
+        <w:rFonts w:ascii="Wingdings" w:hAnsi="Wingdings" w:hint="default"/>
+      </w:rPr>
+    </w:lvl>
+    <w:lvl w:ilvl="3" w:tplc="14090001" w:tentative="1">
+      <w:start w:val="1"/>
+      <w:numFmt w:val="bullet"/>
+      <w:lvlText w:val=""/>
+      <w:lvlJc w:val="left"/>
+      <w:pPr>
+        <w:ind w:left="2520" w:hanging="360"/>
+      </w:pPr>
+      <w:rPr>
+        <w:rFonts w:ascii="Symbol" w:hAnsi="Symbol" w:hint="default"/>
+      </w:rPr>
+    </w:lvl>
+    <w:lvl w:ilvl="4" w:tplc="14090003" w:tentative="1">
+      <w:start w:val="1"/>
+      <w:numFmt w:val="bullet"/>
+      <w:lvlText w:val="o"/>
+      <w:lvlJc w:val="left"/>
+      <w:pPr>
+        <w:ind w:left="3240" w:hanging="360"/>
+      </w:pPr>
+      <w:rPr>
+        <w:rFonts w:ascii="Courier New" w:hAnsi="Courier New" w:cs="Courier New" w:hint="default"/>
+      </w:rPr>
+    </w:lvl>
+    <w:lvl w:ilvl="5" w:tplc="14090005" w:tentative="1">
+      <w:start w:val="1"/>
+      <w:numFmt w:val="bullet"/>
+      <w:lvlText w:val=""/>
+      <w:lvlJc w:val="left"/>
+      <w:pPr>
+        <w:ind w:left="3960" w:hanging="360"/>
+      </w:pPr>
+      <w:rPr>
+        <w:rFonts w:ascii="Wingdings" w:hAnsi="Wingdings" w:hint="default"/>
+      </w:rPr>
+    </w:lvl>
+    <w:lvl w:ilvl="6" w:tplc="14090001" w:tentative="1">
+      <w:start w:val="1"/>
+      <w:numFmt w:val="bullet"/>
+      <w:lvlText w:val=""/>
+      <w:lvlJc w:val="left"/>
+      <w:pPr>
+        <w:ind w:left="4680" w:hanging="360"/>
+      </w:pPr>
+      <w:rPr>
+        <w:rFonts w:ascii="Symbol" w:hAnsi="Symbol" w:hint="default"/>
+      </w:rPr>
+    </w:lvl>
+    <w:lvl w:ilvl="7" w:tplc="14090003" w:tentative="1">
+      <w:start w:val="1"/>
+      <w:numFmt w:val="bullet"/>
+      <w:lvlText w:val="o"/>
+      <w:lvlJc w:val="left"/>
+      <w:pPr>
+        <w:ind w:left="5400" w:hanging="360"/>
+      </w:pPr>
+      <w:rPr>
+        <w:rFonts w:ascii="Courier New" w:hAnsi="Courier New" w:cs="Courier New" w:hint="default"/>
+      </w:rPr>
+    </w:lvl>
+    <w:lvl w:ilvl="8" w:tplc="14090005" w:tentative="1">
+      <w:start w:val="1"/>
+      <w:numFmt w:val="bullet"/>
+      <w:lvlText w:val=""/>
+      <w:lvlJc w:val="left"/>
+      <w:pPr>
+        <w:ind w:left="6120" w:hanging="360"/>
+      </w:pPr>
+      <w:rPr>
+        <w:rFonts w:ascii="Wingdings" w:hAnsi="Wingdings" w:hint="default"/>
+      </w:rPr>
+    </w:lvl>
+  </w:abstractNum>
+  <w:abstractNum w:abstractNumId="19" w15:restartNumberingAfterBreak="0">
     <w:nsid w:val="61E5548B"/>
     <w:multiLevelType w:val="hybridMultilevel"/>
     <w:tmpl w:val="8570A53A"/>
@@ -5791,7 +6513,120 @@
       </w:pPr>
     </w:lvl>
   </w:abstractNum>
-  <w:abstractNum w:abstractNumId="17" w15:restartNumberingAfterBreak="0">
+  <w:abstractNum w:abstractNumId="20" w15:restartNumberingAfterBreak="0">
+    <w:nsid w:val="635B618E"/>
+    <w:multiLevelType w:val="hybridMultilevel"/>
+    <w:tmpl w:val="B7AE001E"/>
+    <w:lvl w:ilvl="0" w:tplc="14090001">
+      <w:start w:val="1"/>
+      <w:numFmt w:val="bullet"/>
+      <w:lvlText w:val=""/>
+      <w:lvlJc w:val="left"/>
+      <w:pPr>
+        <w:ind w:left="360" w:hanging="360"/>
+      </w:pPr>
+      <w:rPr>
+        <w:rFonts w:ascii="Symbol" w:hAnsi="Symbol" w:hint="default"/>
+      </w:rPr>
+    </w:lvl>
+    <w:lvl w:ilvl="1" w:tplc="14090003" w:tentative="1">
+      <w:start w:val="1"/>
+      <w:numFmt w:val="bullet"/>
+      <w:lvlText w:val="o"/>
+      <w:lvlJc w:val="left"/>
+      <w:pPr>
+        <w:ind w:left="1080" w:hanging="360"/>
+      </w:pPr>
+      <w:rPr>
+        <w:rFonts w:ascii="Courier New" w:hAnsi="Courier New" w:cs="Courier New" w:hint="default"/>
+      </w:rPr>
+    </w:lvl>
+    <w:lvl w:ilvl="2" w:tplc="14090005" w:tentative="1">
+      <w:start w:val="1"/>
+      <w:numFmt w:val="bullet"/>
+      <w:lvlText w:val=""/>
+      <w:lvlJc w:val="left"/>
+      <w:pPr>
+        <w:ind w:left="1800" w:hanging="360"/>
+      </w:pPr>
+      <w:rPr>
+        <w:rFonts w:ascii="Wingdings" w:hAnsi="Wingdings" w:hint="default"/>
+      </w:rPr>
+    </w:lvl>
+    <w:lvl w:ilvl="3" w:tplc="14090001" w:tentative="1">
+      <w:start w:val="1"/>
+      <w:numFmt w:val="bullet"/>
+      <w:lvlText w:val=""/>
+      <w:lvlJc w:val="left"/>
+      <w:pPr>
+        <w:ind w:left="2520" w:hanging="360"/>
+      </w:pPr>
+      <w:rPr>
+        <w:rFonts w:ascii="Symbol" w:hAnsi="Symbol" w:hint="default"/>
+      </w:rPr>
+    </w:lvl>
+    <w:lvl w:ilvl="4" w:tplc="14090003" w:tentative="1">
+      <w:start w:val="1"/>
+      <w:numFmt w:val="bullet"/>
+      <w:lvlText w:val="o"/>
+      <w:lvlJc w:val="left"/>
+      <w:pPr>
+        <w:ind w:left="3240" w:hanging="360"/>
+      </w:pPr>
+      <w:rPr>
+        <w:rFonts w:ascii="Courier New" w:hAnsi="Courier New" w:cs="Courier New" w:hint="default"/>
+      </w:rPr>
+    </w:lvl>
+    <w:lvl w:ilvl="5" w:tplc="14090005" w:tentative="1">
+      <w:start w:val="1"/>
+      <w:numFmt w:val="bullet"/>
+      <w:lvlText w:val=""/>
+      <w:lvlJc w:val="left"/>
+      <w:pPr>
+        <w:ind w:left="3960" w:hanging="360"/>
+      </w:pPr>
+      <w:rPr>
+        <w:rFonts w:ascii="Wingdings" w:hAnsi="Wingdings" w:hint="default"/>
+      </w:rPr>
+    </w:lvl>
+    <w:lvl w:ilvl="6" w:tplc="14090001" w:tentative="1">
+      <w:start w:val="1"/>
+      <w:numFmt w:val="bullet"/>
+      <w:lvlText w:val=""/>
+      <w:lvlJc w:val="left"/>
+      <w:pPr>
+        <w:ind w:left="4680" w:hanging="360"/>
+      </w:pPr>
+      <w:rPr>
+        <w:rFonts w:ascii="Symbol" w:hAnsi="Symbol" w:hint="default"/>
+      </w:rPr>
+    </w:lvl>
+    <w:lvl w:ilvl="7" w:tplc="14090003" w:tentative="1">
+      <w:start w:val="1"/>
+      <w:numFmt w:val="bullet"/>
+      <w:lvlText w:val="o"/>
+      <w:lvlJc w:val="left"/>
+      <w:pPr>
+        <w:ind w:left="5400" w:hanging="360"/>
+      </w:pPr>
+      <w:rPr>
+        <w:rFonts w:ascii="Courier New" w:hAnsi="Courier New" w:cs="Courier New" w:hint="default"/>
+      </w:rPr>
+    </w:lvl>
+    <w:lvl w:ilvl="8" w:tplc="14090005" w:tentative="1">
+      <w:start w:val="1"/>
+      <w:numFmt w:val="bullet"/>
+      <w:lvlText w:val=""/>
+      <w:lvlJc w:val="left"/>
+      <w:pPr>
+        <w:ind w:left="6120" w:hanging="360"/>
+      </w:pPr>
+      <w:rPr>
+        <w:rFonts w:ascii="Wingdings" w:hAnsi="Wingdings" w:hint="default"/>
+      </w:rPr>
+    </w:lvl>
+  </w:abstractNum>
+  <w:abstractNum w:abstractNumId="21" w15:restartNumberingAfterBreak="0">
     <w:nsid w:val="65B065B4"/>
     <w:multiLevelType w:val="hybridMultilevel"/>
     <w:tmpl w:val="5D700912"/>
@@ -5905,7 +6740,7 @@
       </w:rPr>
     </w:lvl>
   </w:abstractNum>
-  <w:abstractNum w:abstractNumId="18" w15:restartNumberingAfterBreak="0">
+  <w:abstractNum w:abstractNumId="22" w15:restartNumberingAfterBreak="0">
     <w:nsid w:val="675A2476"/>
     <w:multiLevelType w:val="hybridMultilevel"/>
     <w:tmpl w:val="B96AAEAE"/>
@@ -6018,7 +6853,7 @@
       </w:rPr>
     </w:lvl>
   </w:abstractNum>
-  <w:abstractNum w:abstractNumId="19" w15:restartNumberingAfterBreak="0">
+  <w:abstractNum w:abstractNumId="23" w15:restartNumberingAfterBreak="0">
     <w:nsid w:val="6C704C18"/>
     <w:multiLevelType w:val="hybridMultilevel"/>
     <w:tmpl w:val="67D27778"/>
@@ -6107,7 +6942,7 @@
       </w:pPr>
     </w:lvl>
   </w:abstractNum>
-  <w:abstractNum w:abstractNumId="20" w15:restartNumberingAfterBreak="0">
+  <w:abstractNum w:abstractNumId="24" w15:restartNumberingAfterBreak="0">
     <w:nsid w:val="73560715"/>
     <w:multiLevelType w:val="hybridMultilevel"/>
     <w:tmpl w:val="BECE77BE"/>
@@ -6193,7 +7028,7 @@
       </w:pPr>
     </w:lvl>
   </w:abstractNum>
-  <w:abstractNum w:abstractNumId="21" w15:restartNumberingAfterBreak="0">
+  <w:abstractNum w:abstractNumId="25" w15:restartNumberingAfterBreak="0">
     <w:nsid w:val="74AA6EC1"/>
     <w:multiLevelType w:val="hybridMultilevel"/>
     <w:tmpl w:val="8570A53A"/>
@@ -6282,7 +7117,7 @@
       </w:pPr>
     </w:lvl>
   </w:abstractNum>
-  <w:abstractNum w:abstractNumId="22" w15:restartNumberingAfterBreak="0">
+  <w:abstractNum w:abstractNumId="26" w15:restartNumberingAfterBreak="0">
     <w:nsid w:val="77AC42FB"/>
     <w:multiLevelType w:val="hybridMultilevel"/>
     <w:tmpl w:val="BECE77BE"/>
@@ -6368,7 +7203,7 @@
       </w:pPr>
     </w:lvl>
   </w:abstractNum>
-  <w:abstractNum w:abstractNumId="23" w15:restartNumberingAfterBreak="0">
+  <w:abstractNum w:abstractNumId="27" w15:restartNumberingAfterBreak="0">
     <w:nsid w:val="79272679"/>
     <w:multiLevelType w:val="hybridMultilevel"/>
     <w:tmpl w:val="11C071FC"/>
@@ -6482,76 +7317,88 @@
     </w:lvl>
   </w:abstractNum>
   <w:num w:numId="1" w16cid:durableId="1511792884">
-    <w:abstractNumId w:val="0"/>
+    <w:abstractNumId w:val="1"/>
   </w:num>
   <w:num w:numId="2" w16cid:durableId="1564297178">
+    <w:abstractNumId w:val="13"/>
+  </w:num>
+  <w:num w:numId="3" w16cid:durableId="1405642523">
+    <w:abstractNumId w:val="21"/>
+  </w:num>
+  <w:num w:numId="4" w16cid:durableId="1598831606">
+    <w:abstractNumId w:val="7"/>
+  </w:num>
+  <w:num w:numId="5" w16cid:durableId="2004770207">
+    <w:abstractNumId w:val="3"/>
+  </w:num>
+  <w:num w:numId="6" w16cid:durableId="237516534">
+    <w:abstractNumId w:val="9"/>
+  </w:num>
+  <w:num w:numId="7" w16cid:durableId="1496796575">
+    <w:abstractNumId w:val="17"/>
+  </w:num>
+  <w:num w:numId="8" w16cid:durableId="1475176330">
+    <w:abstractNumId w:val="5"/>
+  </w:num>
+  <w:num w:numId="9" w16cid:durableId="1136751624">
+    <w:abstractNumId w:val="11"/>
+  </w:num>
+  <w:num w:numId="10" w16cid:durableId="1363627534">
+    <w:abstractNumId w:val="23"/>
+  </w:num>
+  <w:num w:numId="11" w16cid:durableId="597173261">
+    <w:abstractNumId w:val="15"/>
+  </w:num>
+  <w:num w:numId="12" w16cid:durableId="1393192729">
+    <w:abstractNumId w:val="25"/>
+  </w:num>
+  <w:num w:numId="13" w16cid:durableId="2111274085">
+    <w:abstractNumId w:val="6"/>
+  </w:num>
+  <w:num w:numId="14" w16cid:durableId="1289780109">
+    <w:abstractNumId w:val="19"/>
+  </w:num>
+  <w:num w:numId="15" w16cid:durableId="775948869">
+    <w:abstractNumId w:val="8"/>
+  </w:num>
+  <w:num w:numId="16" w16cid:durableId="1071003879">
+    <w:abstractNumId w:val="10"/>
+  </w:num>
+  <w:num w:numId="17" w16cid:durableId="1415979413">
+    <w:abstractNumId w:val="4"/>
+  </w:num>
+  <w:num w:numId="18" w16cid:durableId="1929999945">
+    <w:abstractNumId w:val="26"/>
+  </w:num>
+  <w:num w:numId="19" w16cid:durableId="1383794188">
+    <w:abstractNumId w:val="2"/>
+  </w:num>
+  <w:num w:numId="20" w16cid:durableId="409161819">
     <w:abstractNumId w:val="12"/>
   </w:num>
-  <w:num w:numId="3" w16cid:durableId="1405642523">
-    <w:abstractNumId w:val="17"/>
+  <w:num w:numId="21" w16cid:durableId="1222523425">
+    <w:abstractNumId w:val="24"/>
   </w:num>
-  <w:num w:numId="4" w16cid:durableId="1598831606">
-    <w:abstractNumId w:val="6"/>
+  <w:num w:numId="22" w16cid:durableId="671628">
+    <w:abstractNumId w:val="27"/>
   </w:num>
-  <w:num w:numId="5" w16cid:durableId="2004770207">
-    <w:abstractNumId w:val="2"/>
-  </w:num>
-  <w:num w:numId="6" w16cid:durableId="237516534">
-    <w:abstractNumId w:val="8"/>
-  </w:num>
-  <w:num w:numId="7" w16cid:durableId="1496796575">
-    <w:abstractNumId w:val="15"/>
-  </w:num>
-  <w:num w:numId="8" w16cid:durableId="1475176330">
-    <w:abstractNumId w:val="4"/>
-  </w:num>
-  <w:num w:numId="9" w16cid:durableId="1136751624">
-    <w:abstractNumId w:val="10"/>
-  </w:num>
-  <w:num w:numId="10" w16cid:durableId="1363627534">
-    <w:abstractNumId w:val="19"/>
-  </w:num>
-  <w:num w:numId="11" w16cid:durableId="597173261">
-    <w:abstractNumId w:val="13"/>
-  </w:num>
-  <w:num w:numId="12" w16cid:durableId="1393192729">
-    <w:abstractNumId w:val="21"/>
-  </w:num>
-  <w:num w:numId="13" w16cid:durableId="2111274085">
-    <w:abstractNumId w:val="5"/>
-  </w:num>
-  <w:num w:numId="14" w16cid:durableId="1289780109">
+  <w:num w:numId="23" w16cid:durableId="477578719">
     <w:abstractNumId w:val="16"/>
   </w:num>
-  <w:num w:numId="15" w16cid:durableId="775948869">
-    <w:abstractNumId w:val="7"/>
-  </w:num>
-  <w:num w:numId="16" w16cid:durableId="1071003879">
-    <w:abstractNumId w:val="9"/>
-  </w:num>
-  <w:num w:numId="17" w16cid:durableId="1415979413">
-    <w:abstractNumId w:val="3"/>
-  </w:num>
-  <w:num w:numId="18" w16cid:durableId="1929999945">
+  <w:num w:numId="24" w16cid:durableId="1630821583">
     <w:abstractNumId w:val="22"/>
   </w:num>
-  <w:num w:numId="19" w16cid:durableId="1383794188">
-    <w:abstractNumId w:val="1"/>
-  </w:num>
-  <w:num w:numId="20" w16cid:durableId="409161819">
-    <w:abstractNumId w:val="11"/>
-  </w:num>
-  <w:num w:numId="21" w16cid:durableId="1222523425">
+  <w:num w:numId="25" w16cid:durableId="631909647">
     <w:abstractNumId w:val="20"/>
   </w:num>
-  <w:num w:numId="22" w16cid:durableId="671628">
-    <w:abstractNumId w:val="23"/>
+  <w:num w:numId="26" w16cid:durableId="1483695899">
+    <w:abstractNumId w:val="18"/>
   </w:num>
-  <w:num w:numId="23" w16cid:durableId="477578719">
+  <w:num w:numId="27" w16cid:durableId="1198396081">
     <w:abstractNumId w:val="14"/>
   </w:num>
-  <w:num w:numId="24" w16cid:durableId="1630821583">
-    <w:abstractNumId w:val="18"/>
+  <w:num w:numId="28" w16cid:durableId="1417091306">
+    <w:abstractNumId w:val="0"/>
   </w:num>
 </w:numbering>
 </file>
@@ -6562,7 +7409,7 @@
     <w:rPrDefault>
       <w:rPr>
         <w:rFonts w:ascii="Times New Roman" w:eastAsia="Times New Roman" w:hAnsi="Times New Roman" w:cs="Times New Roman"/>
-        <w:lang w:val="en-NZ" w:eastAsia="en-NZ" w:bidi="my-MM"/>
+        <w:lang w:val="en-NZ" w:eastAsia="ja-JP" w:bidi="ar-SA"/>
       </w:rPr>
     </w:rPrDefault>
     <w:pPrDefault/>
@@ -6855,7 +7702,7 @@
     <w:rPr>
       <w:sz w:val="24"/>
       <w:szCs w:val="24"/>
-      <w:lang w:val="en-US" w:eastAsia="en-US" w:bidi="ar-SA"/>
+      <w:lang w:eastAsia="en-US"/>
     </w:rPr>
   </w:style>
   <w:style w:type="character" w:default="1" w:styleId="DefaultParagraphFont">

</xml_diff>